<commit_message>
Add library, articles, notifications, 4-tab nav per flow doc
</commit_message>
<xml_diff>
--- a/source_docs/2. BRD/Phụ huynh ver 2.1.docx
+++ b/source_docs/2. BRD/Phụ huynh ver 2.1.docx
@@ -642,6 +642,7 @@
                 <w:szCs w:val="24"/>
               </w:rPr>
             </w:pPr>
+            <w:bookmarkStart w:id="1" w:name="_Hlk226844420"/>
             <w:r>
               <w:rPr>
                 <w:rFonts w:eastAsia="Times New Roman" w:cs="Times New Roman"/>
@@ -778,7 +779,7 @@
                 <w:szCs w:val="24"/>
               </w:rPr>
             </w:pPr>
-            <w:bookmarkStart w:id="1" w:name="_Hlk221787750"/>
+            <w:bookmarkStart w:id="2" w:name="_Hlk221787750"/>
             <w:r>
               <w:rPr>
                 <w:rFonts w:ascii="Segoe UI Emoji" w:eastAsia="Times New Roman" w:hAnsi="Segoe UI Emoji" w:cs="Segoe UI Emoji"/>
@@ -1516,6 +1517,7 @@
       </w:tr>
     </w:tbl>
     <w:bookmarkEnd w:id="1"/>
+    <w:bookmarkEnd w:id="2"/>
     <w:p>
       <w:pPr>
         <w:pStyle w:val="ListParagraph"/>
@@ -1740,6 +1742,7 @@
                 <w:szCs w:val="24"/>
               </w:rPr>
             </w:pPr>
+            <w:bookmarkStart w:id="3" w:name="_Hlk226844432"/>
             <w:r>
               <w:rPr>
                 <w:rFonts w:eastAsia="Times New Roman" w:cs="Times New Roman"/>
@@ -2018,6 +2021,7 @@
           </w:p>
         </w:tc>
       </w:tr>
+      <w:bookmarkEnd w:id="3"/>
     </w:tbl>
     <w:p>
       <w:pPr>
@@ -2142,6 +2146,7 @@
                 <w:szCs w:val="24"/>
               </w:rPr>
             </w:pPr>
+            <w:bookmarkStart w:id="4" w:name="_Hlk226844442"/>
             <w:r>
               <w:rPr>
                 <w:rFonts w:eastAsia="Times New Roman" w:cs="Times New Roman"/>
@@ -2676,6 +2681,7 @@
         </w:tc>
       </w:tr>
     </w:tbl>
+    <w:bookmarkEnd w:id="4"/>
     <w:p>
       <w:pPr>
         <w:pStyle w:val="ListParagraph"/>
@@ -5148,8 +5154,8 @@
         <w:lastRenderedPageBreak/>
         <w:t>Thông tin cơ bản</w:t>
       </w:r>
-      <w:bookmarkStart w:id="2" w:name="_Hlk223697806"/>
-      <w:bookmarkStart w:id="3" w:name="_Hlk222746571"/>
+      <w:bookmarkStart w:id="5" w:name="_Hlk223697806"/>
+      <w:bookmarkStart w:id="6" w:name="_Hlk222746571"/>
     </w:p>
     <w:tbl>
       <w:tblPr>
@@ -5172,9 +5178,10 @@
         <w:tblLook w:val="04A0" w:firstRow="1" w:lastRow="0" w:firstColumn="1" w:lastColumn="0" w:noHBand="0" w:noVBand="1"/>
       </w:tblPr>
       <w:tblGrid>
-        <w:gridCol w:w="1062"/>
-        <w:gridCol w:w="4535"/>
-        <w:gridCol w:w="2835"/>
+        <w:gridCol w:w="669"/>
+        <w:gridCol w:w="3856"/>
+        <w:gridCol w:w="2342"/>
+        <w:gridCol w:w="2527"/>
       </w:tblGrid>
       <w:tr>
         <w:trPr>
@@ -5183,7 +5190,7 @@
         </w:trPr>
         <w:tc>
           <w:tcPr>
-            <w:tcW w:w="0" w:type="auto"/>
+            <w:tcW w:w="624" w:type="dxa"/>
             <w:vAlign w:val="center"/>
             <w:hideMark/>
           </w:tcPr>
@@ -5199,8 +5206,8 @@
                 <w:szCs w:val="24"/>
               </w:rPr>
             </w:pPr>
-            <w:bookmarkStart w:id="4" w:name="_Hlk222746473"/>
-            <w:bookmarkEnd w:id="2"/>
+            <w:bookmarkStart w:id="7" w:name="_Hlk222746473"/>
+            <w:bookmarkEnd w:id="5"/>
             <w:r>
               <w:rPr>
                 <w:rFonts w:eastAsia="Times New Roman" w:cs="Times New Roman"/>
@@ -5215,7 +5222,7 @@
         </w:tc>
         <w:tc>
           <w:tcPr>
-            <w:tcW w:w="4505" w:type="dxa"/>
+            <w:tcW w:w="3826" w:type="dxa"/>
           </w:tcPr>
           <w:p>
             <w:pPr>
@@ -5243,7 +5250,35 @@
         </w:tc>
         <w:tc>
           <w:tcPr>
-            <w:tcW w:w="2790" w:type="dxa"/>
+            <w:tcW w:w="2312" w:type="dxa"/>
+          </w:tcPr>
+          <w:p>
+            <w:pPr>
+              <w:spacing w:after="0" w:line="240" w:lineRule="auto"/>
+              <w:jc w:val="center"/>
+              <w:rPr>
+                <w:rFonts w:eastAsia="Times New Roman" w:cs="Times New Roman"/>
+                <w:b/>
+                <w:bCs/>
+                <w:sz w:val="24"/>
+                <w:szCs w:val="24"/>
+              </w:rPr>
+            </w:pPr>
+            <w:r>
+              <w:rPr>
+                <w:rFonts w:eastAsia="Times New Roman" w:cs="Times New Roman"/>
+                <w:b/>
+                <w:bCs/>
+                <w:sz w:val="24"/>
+                <w:szCs w:val="24"/>
+              </w:rPr>
+              <w:t>Mức độ tăng trưởng</w:t>
+            </w:r>
+          </w:p>
+        </w:tc>
+        <w:tc>
+          <w:tcPr>
+            <w:tcW w:w="2482" w:type="dxa"/>
             <w:vAlign w:val="center"/>
             <w:hideMark/>
           </w:tcPr>
@@ -5278,7 +5313,7 @@
         </w:trPr>
         <w:tc>
           <w:tcPr>
-            <w:tcW w:w="0" w:type="auto"/>
+            <w:tcW w:w="624" w:type="dxa"/>
             <w:vAlign w:val="center"/>
             <w:hideMark/>
           </w:tcPr>
@@ -5304,7 +5339,7 @@
         </w:tc>
         <w:tc>
           <w:tcPr>
-            <w:tcW w:w="4505" w:type="dxa"/>
+            <w:tcW w:w="3826" w:type="dxa"/>
           </w:tcPr>
           <w:p>
             <w:pPr>
@@ -5328,7 +5363,77 @@
         </w:tc>
         <w:tc>
           <w:tcPr>
-            <w:tcW w:w="2790" w:type="dxa"/>
+            <w:tcW w:w="2312" w:type="dxa"/>
+          </w:tcPr>
+          <w:p>
+            <w:pPr>
+              <w:spacing w:after="0" w:line="240" w:lineRule="auto"/>
+              <w:jc w:val="left"/>
+              <w:rPr>
+                <w:rFonts w:eastAsia="Times New Roman" w:cs="Times New Roman"/>
+                <w:sz w:val="24"/>
+                <w:szCs w:val="24"/>
+              </w:rPr>
+            </w:pPr>
+            <w:r>
+              <w:rPr>
+                <w:rFonts w:eastAsia="Times New Roman" w:cs="Times New Roman"/>
+                <w:sz w:val="24"/>
+                <w:szCs w:val="24"/>
+              </w:rPr>
+              <w:t>=chiều cao tháng T – chiều cao tháng T-3</w:t>
+            </w:r>
+          </w:p>
+          <w:p>
+            <w:pPr>
+              <w:spacing w:after="0" w:line="240" w:lineRule="auto"/>
+              <w:jc w:val="left"/>
+              <w:rPr>
+                <w:rFonts w:eastAsia="Times New Roman" w:cs="Times New Roman"/>
+                <w:sz w:val="24"/>
+                <w:szCs w:val="24"/>
+              </w:rPr>
+            </w:pPr>
+            <w:r>
+              <w:rPr>
+                <w:rFonts w:eastAsia="Times New Roman" w:cs="Times New Roman"/>
+                <w:sz w:val="24"/>
+                <w:szCs w:val="24"/>
+              </w:rPr>
+              <w:t>Nếu tăng thì màu xanh dương</w:t>
+            </w:r>
+          </w:p>
+          <w:p>
+            <w:pPr>
+              <w:spacing w:after="0" w:line="240" w:lineRule="auto"/>
+              <w:jc w:val="left"/>
+              <w:rPr>
+                <w:rFonts w:eastAsia="Times New Roman" w:cs="Times New Roman"/>
+                <w:sz w:val="24"/>
+                <w:szCs w:val="24"/>
+              </w:rPr>
+            </w:pPr>
+            <w:r>
+              <w:rPr>
+                <w:rFonts w:eastAsia="Times New Roman" w:cs="Times New Roman"/>
+                <w:sz w:val="24"/>
+                <w:szCs w:val="24"/>
+              </w:rPr>
+              <w:t xml:space="preserve">Nếu </w:t>
+            </w:r>
+            <w:r>
+              <w:rPr>
+                <w:rFonts w:eastAsia="Times New Roman" w:cs="Times New Roman"/>
+                <w:sz w:val="24"/>
+                <w:szCs w:val="24"/>
+              </w:rPr>
+              <w:t>không tăng thì màu vàng</w:t>
+            </w:r>
+          </w:p>
+        </w:tc>
+        <w:tc>
+          <w:tcPr>
+            <w:tcW w:w="2482" w:type="dxa"/>
             <w:vAlign w:val="center"/>
             <w:hideMark/>
           </w:tcPr>
@@ -5359,7 +5464,7 @@
         </w:trPr>
         <w:tc>
           <w:tcPr>
-            <w:tcW w:w="0" w:type="auto"/>
+            <w:tcW w:w="624" w:type="dxa"/>
             <w:vAlign w:val="center"/>
             <w:hideMark/>
           </w:tcPr>
@@ -5385,7 +5490,7 @@
         </w:tc>
         <w:tc>
           <w:tcPr>
-            <w:tcW w:w="4505" w:type="dxa"/>
+            <w:tcW w:w="3826" w:type="dxa"/>
           </w:tcPr>
           <w:p>
             <w:pPr>
@@ -5409,7 +5514,88 @@
         </w:tc>
         <w:tc>
           <w:tcPr>
-            <w:tcW w:w="2790" w:type="dxa"/>
+            <w:tcW w:w="2312" w:type="dxa"/>
+          </w:tcPr>
+          <w:p>
+            <w:pPr>
+              <w:spacing w:after="0" w:line="240" w:lineRule="auto"/>
+              <w:jc w:val="left"/>
+              <w:rPr>
+                <w:rFonts w:eastAsia="Times New Roman" w:cs="Times New Roman"/>
+                <w:sz w:val="24"/>
+                <w:szCs w:val="24"/>
+              </w:rPr>
+            </w:pPr>
+            <w:r>
+              <w:rPr>
+                <w:rFonts w:eastAsia="Times New Roman" w:cs="Times New Roman"/>
+                <w:sz w:val="24"/>
+                <w:szCs w:val="24"/>
+              </w:rPr>
+              <w:t>=chiều cao tháng T – chiều cao tháng T-3</w:t>
+            </w:r>
+          </w:p>
+          <w:p>
+            <w:pPr>
+              <w:spacing w:after="0" w:line="240" w:lineRule="auto"/>
+              <w:jc w:val="left"/>
+              <w:rPr>
+                <w:rFonts w:eastAsia="Times New Roman" w:cs="Times New Roman"/>
+                <w:sz w:val="24"/>
+                <w:szCs w:val="24"/>
+              </w:rPr>
+            </w:pPr>
+            <w:r>
+              <w:rPr>
+                <w:rFonts w:eastAsia="Times New Roman" w:cs="Times New Roman"/>
+                <w:sz w:val="24"/>
+                <w:szCs w:val="24"/>
+              </w:rPr>
+              <w:t>Nếu tăng thì màu xanh dương</w:t>
+            </w:r>
+          </w:p>
+          <w:p>
+            <w:pPr>
+              <w:spacing w:after="0" w:line="240" w:lineRule="auto"/>
+              <w:jc w:val="left"/>
+              <w:rPr>
+                <w:rFonts w:eastAsia="Times New Roman" w:cs="Times New Roman"/>
+                <w:sz w:val="24"/>
+                <w:szCs w:val="24"/>
+              </w:rPr>
+            </w:pPr>
+            <w:r>
+              <w:rPr>
+                <w:rFonts w:eastAsia="Times New Roman" w:cs="Times New Roman"/>
+                <w:sz w:val="24"/>
+                <w:szCs w:val="24"/>
+              </w:rPr>
+              <w:t>Nếu không tăng thì màu vàng</w:t>
+            </w:r>
+          </w:p>
+          <w:p>
+            <w:pPr>
+              <w:spacing w:after="0" w:line="240" w:lineRule="auto"/>
+              <w:jc w:val="left"/>
+              <w:rPr>
+                <w:rFonts w:eastAsia="Times New Roman" w:cs="Times New Roman"/>
+                <w:sz w:val="24"/>
+                <w:szCs w:val="24"/>
+              </w:rPr>
+            </w:pPr>
+            <w:r>
+              <w:rPr>
+                <w:rFonts w:eastAsia="Times New Roman" w:cs="Times New Roman"/>
+                <w:sz w:val="24"/>
+                <w:szCs w:val="24"/>
+              </w:rPr>
+              <w:t>Nếu giảm thì màu đỏ</w:t>
+            </w:r>
+          </w:p>
+        </w:tc>
+        <w:tc>
+          <w:tcPr>
+            <w:tcW w:w="2482" w:type="dxa"/>
             <w:vAlign w:val="center"/>
             <w:hideMark/>
           </w:tcPr>
@@ -5440,7 +5626,7 @@
         </w:trPr>
         <w:tc>
           <w:tcPr>
-            <w:tcW w:w="0" w:type="auto"/>
+            <w:tcW w:w="624" w:type="dxa"/>
             <w:vAlign w:val="center"/>
             <w:hideMark/>
           </w:tcPr>
@@ -5466,7 +5652,7 @@
         </w:tc>
         <w:tc>
           <w:tcPr>
-            <w:tcW w:w="4505" w:type="dxa"/>
+            <w:tcW w:w="3826" w:type="dxa"/>
           </w:tcPr>
           <w:p>
             <w:pPr>
@@ -5490,7 +5676,23 @@
         </w:tc>
         <w:tc>
           <w:tcPr>
-            <w:tcW w:w="2790" w:type="dxa"/>
+            <w:tcW w:w="2312" w:type="dxa"/>
+          </w:tcPr>
+          <w:p>
+            <w:pPr>
+              <w:spacing w:after="0" w:line="240" w:lineRule="auto"/>
+              <w:jc w:val="left"/>
+              <w:rPr>
+                <w:rFonts w:eastAsia="Times New Roman" w:cs="Times New Roman"/>
+                <w:sz w:val="24"/>
+                <w:szCs w:val="24"/>
+              </w:rPr>
+            </w:pPr>
+          </w:p>
+        </w:tc>
+        <w:tc>
+          <w:tcPr>
+            <w:tcW w:w="2482" w:type="dxa"/>
             <w:vAlign w:val="center"/>
             <w:hideMark/>
           </w:tcPr>
@@ -5516,7 +5718,7 @@
         </w:tc>
       </w:tr>
     </w:tbl>
-    <w:bookmarkEnd w:id="3"/>
+    <w:bookmarkEnd w:id="6"/>
     <w:p>
       <w:pPr>
         <w:spacing w:after="0" w:line="240" w:lineRule="auto"/>
@@ -6326,6 +6528,7 @@
                 <w:sz w:val="24"/>
                 <w:szCs w:val="24"/>
               </w:rPr>
+              <w:lastRenderedPageBreak/>
               <w:t>10</w:t>
             </w:r>
           </w:p>
@@ -6831,7 +7034,6 @@
                 <w:sz w:val="24"/>
                 <w:szCs w:val="24"/>
               </w:rPr>
-              <w:lastRenderedPageBreak/>
               <w:t>15</w:t>
             </w:r>
           </w:p>
@@ -8531,6 +8733,7 @@
                 <w:sz w:val="24"/>
                 <w:szCs w:val="24"/>
               </w:rPr>
+              <w:lastRenderedPageBreak/>
               <w:t>16</w:t>
             </w:r>
           </w:p>
@@ -8811,7 +9014,7 @@
         </w:tc>
       </w:tr>
     </w:tbl>
-    <w:bookmarkEnd w:id="4"/>
+    <w:bookmarkEnd w:id="7"/>
     <w:p>
       <w:pPr>
         <w:pStyle w:val="ListParagraph"/>
@@ -8835,7 +9038,7 @@
           <w:sz w:val="24"/>
           <w:szCs w:val="24"/>
         </w:rPr>
-        <w:t>Thông tin chuyên sâu</w:t>
+        <w:t>Tốc độ tăng trưởng</w:t>
       </w:r>
     </w:p>
     <w:p>
@@ -8879,7 +9082,247 @@
           <w:szCs w:val="24"/>
           <w:highlight w:val="yellow"/>
         </w:rPr>
-        <w:t>Drop list: 12 tháng gần nhất/24 tháng gần nhất/36 tháng gần nhất/5 năm gần nhất</w:t>
+        <w:t>Người dùng chọn</w:t>
+      </w:r>
+      <w:r>
+        <w:rPr>
+          <w:rFonts w:eastAsia="Times New Roman" w:cs="Times New Roman"/>
+          <w:sz w:val="24"/>
+          <w:szCs w:val="24"/>
+          <w:highlight w:val="yellow"/>
+        </w:rPr>
+        <w:t xml:space="preserve"> tần suất</w:t>
+      </w:r>
+      <w:r>
+        <w:rPr>
+          <w:rFonts w:eastAsia="Times New Roman" w:cs="Times New Roman"/>
+          <w:sz w:val="24"/>
+          <w:szCs w:val="24"/>
+          <w:highlight w:val="yellow"/>
+        </w:rPr>
+        <w:t xml:space="preserve"> theo</w:t>
+      </w:r>
+      <w:r>
+        <w:rPr>
+          <w:rFonts w:eastAsia="Times New Roman" w:cs="Times New Roman"/>
+          <w:sz w:val="24"/>
+          <w:szCs w:val="24"/>
+          <w:highlight w:val="yellow"/>
+        </w:rPr>
+        <w:t>:</w:t>
+      </w:r>
+      <w:r>
+        <w:rPr>
+          <w:rFonts w:eastAsia="Times New Roman" w:cs="Times New Roman"/>
+          <w:sz w:val="24"/>
+          <w:szCs w:val="24"/>
+          <w:highlight w:val="yellow"/>
+        </w:rPr>
+        <w:t xml:space="preserve"> tuần/tháng/năm</w:t>
+      </w:r>
+      <w:r>
+        <w:rPr>
+          <w:rFonts w:eastAsia="Times New Roman" w:cs="Times New Roman"/>
+          <w:sz w:val="24"/>
+          <w:szCs w:val="24"/>
+          <w:highlight w:val="yellow"/>
+        </w:rPr>
+        <w:t xml:space="preserve">. </w:t>
+      </w:r>
+    </w:p>
+    <w:p>
+      <w:pPr>
+        <w:pStyle w:val="ListParagraph"/>
+        <w:spacing w:after="0" w:line="240" w:lineRule="auto"/>
+        <w:jc w:val="left"/>
+        <w:rPr>
+          <w:rFonts w:eastAsia="Times New Roman" w:cs="Times New Roman"/>
+          <w:sz w:val="24"/>
+          <w:szCs w:val="24"/>
+          <w:highlight w:val="yellow"/>
+        </w:rPr>
+      </w:pPr>
+      <w:r>
+        <w:rPr>
+          <w:rFonts w:eastAsia="Times New Roman" w:cs="Times New Roman"/>
+          <w:sz w:val="24"/>
+          <w:szCs w:val="24"/>
+          <w:highlight w:val="yellow"/>
+        </w:rPr>
+        <w:t xml:space="preserve">Chọn thời gian: từ ngày </w:t>
+      </w:r>
+      <w:r>
+        <w:rPr>
+          <w:rFonts w:eastAsia="Times New Roman" w:cs="Times New Roman"/>
+          <w:sz w:val="24"/>
+          <w:szCs w:val="24"/>
+          <w:highlight w:val="yellow"/>
+        </w:rPr>
+        <w:t>dd/mm/yyyy đến ngày dd/mm/yyyy trong đó: ngày “đến ngày” được giới hạn như sau:</w:t>
+      </w:r>
+    </w:p>
+    <w:p>
+      <w:pPr>
+        <w:pStyle w:val="ListParagraph"/>
+        <w:spacing w:after="0" w:line="240" w:lineRule="auto"/>
+        <w:jc w:val="left"/>
+        <w:rPr>
+          <w:rFonts w:eastAsia="Times New Roman" w:cs="Times New Roman"/>
+          <w:sz w:val="24"/>
+          <w:szCs w:val="24"/>
+          <w:highlight w:val="yellow"/>
+        </w:rPr>
+      </w:pPr>
+      <w:r>
+        <w:rPr>
+          <w:rFonts w:eastAsia="Times New Roman" w:cs="Times New Roman"/>
+          <w:sz w:val="24"/>
+          <w:szCs w:val="24"/>
+          <w:highlight w:val="yellow"/>
+        </w:rPr>
+        <w:t xml:space="preserve">+ nếu chọn theo tuần giới hạn tối đa 1 năm kể từ ngày “từ ngày”, </w:t>
+      </w:r>
+    </w:p>
+    <w:p>
+      <w:pPr>
+        <w:pStyle w:val="ListParagraph"/>
+        <w:spacing w:after="0" w:line="240" w:lineRule="auto"/>
+        <w:jc w:val="left"/>
+        <w:rPr>
+          <w:rFonts w:eastAsia="Times New Roman" w:cs="Times New Roman"/>
+          <w:sz w:val="24"/>
+          <w:szCs w:val="24"/>
+          <w:highlight w:val="yellow"/>
+        </w:rPr>
+      </w:pPr>
+      <w:r>
+        <w:rPr>
+          <w:rFonts w:eastAsia="Times New Roman" w:cs="Times New Roman"/>
+          <w:sz w:val="24"/>
+          <w:szCs w:val="24"/>
+          <w:highlight w:val="yellow"/>
+        </w:rPr>
+        <w:t xml:space="preserve">+ nếu chọn theo tháng tối đa 3 năm kể từ ngày “từ ngày”, </w:t>
+      </w:r>
+    </w:p>
+    <w:p>
+      <w:pPr>
+        <w:pStyle w:val="ListParagraph"/>
+        <w:spacing w:after="0" w:line="240" w:lineRule="auto"/>
+        <w:jc w:val="left"/>
+        <w:rPr>
+          <w:rFonts w:eastAsia="Times New Roman" w:cs="Times New Roman"/>
+          <w:sz w:val="24"/>
+          <w:szCs w:val="24"/>
+          <w:highlight w:val="yellow"/>
+        </w:rPr>
+      </w:pPr>
+      <w:r>
+        <w:rPr>
+          <w:rFonts w:eastAsia="Times New Roman" w:cs="Times New Roman"/>
+          <w:sz w:val="24"/>
+          <w:szCs w:val="24"/>
+          <w:highlight w:val="yellow"/>
+        </w:rPr>
+        <w:t>+ nếu chọn theo năm tối đa 10 năm kể từ ngày “từ ngày”</w:t>
+      </w:r>
+    </w:p>
+    <w:p>
+      <w:pPr>
+        <w:pStyle w:val="ListParagraph"/>
+        <w:spacing w:after="0" w:line="240" w:lineRule="auto"/>
+        <w:jc w:val="left"/>
+        <w:rPr>
+          <w:rFonts w:eastAsia="Times New Roman" w:cs="Times New Roman"/>
+          <w:sz w:val="24"/>
+          <w:szCs w:val="24"/>
+          <w:highlight w:val="yellow"/>
+        </w:rPr>
+      </w:pPr>
+      <w:r>
+        <w:rPr>
+          <w:rFonts w:eastAsia="Times New Roman" w:cs="Times New Roman"/>
+          <w:sz w:val="24"/>
+          <w:szCs w:val="24"/>
+          <w:highlight w:val="yellow"/>
+        </w:rPr>
+        <w:t>Hiển thị biểu đồ thay đổi chiều cao, cân nặng,</w:t>
+      </w:r>
+      <w:r>
+        <w:rPr>
+          <w:rFonts w:eastAsia="Times New Roman" w:cs="Times New Roman"/>
+          <w:sz w:val="24"/>
+          <w:szCs w:val="24"/>
+          <w:highlight w:val="yellow"/>
+        </w:rPr>
+        <w:t xml:space="preserve"> BMI</w:t>
+      </w:r>
+      <w:r>
+        <w:rPr>
+          <w:rFonts w:eastAsia="Times New Roman" w:cs="Times New Roman"/>
+          <w:sz w:val="24"/>
+          <w:szCs w:val="24"/>
+          <w:highlight w:val="yellow"/>
+        </w:rPr>
+        <w:t xml:space="preserve"> tương ứng và chiều cao, cân nặng, </w:t>
+      </w:r>
+      <w:r>
+        <w:rPr>
+          <w:rFonts w:eastAsia="Times New Roman" w:cs="Times New Roman"/>
+          <w:sz w:val="24"/>
+          <w:szCs w:val="24"/>
+          <w:highlight w:val="yellow"/>
+        </w:rPr>
+        <w:t>BMI</w:t>
+      </w:r>
+      <w:r>
+        <w:rPr>
+          <w:rFonts w:eastAsia="Times New Roman" w:cs="Times New Roman"/>
+          <w:sz w:val="24"/>
+          <w:szCs w:val="24"/>
+          <w:highlight w:val="yellow"/>
+        </w:rPr>
+        <w:t xml:space="preserve"> tương ứng của WHO</w:t>
+      </w:r>
+      <w:r>
+        <w:rPr>
+          <w:rFonts w:eastAsia="Times New Roman" w:cs="Times New Roman"/>
+          <w:sz w:val="24"/>
+          <w:szCs w:val="24"/>
+          <w:highlight w:val="yellow"/>
+        </w:rPr>
+        <w:t xml:space="preserve">. </w:t>
+      </w:r>
+    </w:p>
+    <w:p>
+      <w:pPr>
+        <w:pStyle w:val="ListParagraph"/>
+        <w:spacing w:after="0" w:line="240" w:lineRule="auto"/>
+        <w:jc w:val="left"/>
+        <w:rPr>
+          <w:rFonts w:eastAsia="Times New Roman" w:cs="Times New Roman"/>
+          <w:sz w:val="24"/>
+          <w:szCs w:val="24"/>
+          <w:highlight w:val="yellow"/>
+        </w:rPr>
+      </w:pPr>
+      <w:r>
+        <w:rPr>
+          <w:rFonts w:eastAsia="Times New Roman" w:cs="Times New Roman"/>
+          <w:sz w:val="24"/>
+          <w:szCs w:val="24"/>
+          <w:highlight w:val="yellow"/>
+        </w:rPr>
+        <w:t>Cần tính tuổi của con tại các mốc tuần/tháng/năm =&gt;</w:t>
+      </w:r>
+      <w:r>
+        <w:rPr>
+          <w:rFonts w:eastAsia="Times New Roman" w:cs="Times New Roman"/>
+          <w:sz w:val="24"/>
+          <w:szCs w:val="24"/>
+          <w:highlight w:val="yellow"/>
+        </w:rPr>
+        <w:t>lấy các mốc của WHO tương ứng theo tuổi của con.</w:t>
       </w:r>
     </w:p>
     <w:p>
@@ -8923,7 +9366,6 @@
           <w:sz w:val="24"/>
           <w:szCs w:val="24"/>
         </w:rPr>
-        <w:lastRenderedPageBreak/>
         <w:t>Chu kỳ</w:t>
       </w:r>
     </w:p>
@@ -9014,7 +9456,14 @@
           <w:sz w:val="24"/>
           <w:szCs w:val="24"/>
         </w:rPr>
-        <w:t>có dữ liêij</w:t>
+        <w:t>có dữ l</w:t>
+      </w:r>
+      <w:r>
+        <w:rPr>
+          <w:sz w:val="24"/>
+          <w:szCs w:val="24"/>
+        </w:rPr>
+        <w:t>iệu</w:t>
       </w:r>
       <w:r>
         <w:rPr>
@@ -9683,6 +10132,7 @@
           <w:sz w:val="24"/>
           <w:szCs w:val="24"/>
         </w:rPr>
+        <w:lastRenderedPageBreak/>
         <w:t xml:space="preserve">Nếu tháng T=3 thì tháng T-3=12, T-4=11,…, T-11=1, năm của tháng T-2 đến T-11=năm T-1, </w:t>
       </w:r>
     </w:p>
@@ -9799,7 +10249,14 @@
           <w:sz w:val="24"/>
           <w:szCs w:val="24"/>
         </w:rPr>
-        <w:t xml:space="preserve"> tại Tab 1 - Mình mỗi ngày</w:t>
+        <w:t xml:space="preserve"> tại Tab </w:t>
+      </w:r>
+      <w:r>
+        <w:rPr>
+          <w:sz w:val="24"/>
+          <w:szCs w:val="24"/>
+        </w:rPr>
+        <w:t>Hiểu con</w:t>
       </w:r>
       <w:r>
         <w:rPr>
@@ -9836,7 +10293,7 @@
           <w:sz w:val="24"/>
           <w:szCs w:val="24"/>
         </w:rPr>
-        <w:t>Không trong k</w:t>
+        <w:t>Không trong kỳ</w:t>
       </w:r>
       <w:r>
         <w:rPr>
@@ -9850,13 +10307,6 @@
           <w:sz w:val="24"/>
           <w:szCs w:val="24"/>
         </w:rPr>
-        <w:t>ỳ</w:t>
-      </w:r>
-      <w:r>
-        <w:rPr>
-          <w:sz w:val="24"/>
-          <w:szCs w:val="24"/>
-        </w:rPr>
         <w:t xml:space="preserve"> với nữ hoặc “Không có gì” với nam</w:t>
       </w:r>
       <w:r>
@@ -9864,7 +10314,14 @@
           <w:sz w:val="24"/>
           <w:szCs w:val="24"/>
         </w:rPr>
-        <w:t xml:space="preserve"> tại Tab 1 - Mình mỗi ngày</w:t>
+        <w:t xml:space="preserve"> tại Tab </w:t>
+      </w:r>
+      <w:r>
+        <w:rPr>
+          <w:sz w:val="24"/>
+          <w:szCs w:val="24"/>
+        </w:rPr>
+        <w:t>Hiểu con</w:t>
       </w:r>
       <w:r>
         <w:rPr>
@@ -9941,7 +10398,35 @@
           <w:sz w:val="24"/>
           <w:szCs w:val="24"/>
         </w:rPr>
-        <w:t>+ Nếu có ít nhất 1 trong 3 tháng gần nhất là "Chưa có dữ liệu" thì hiển thị "Chưa có dữ liệu để đánh giá. Con cần checkin đầy đủ trong 3 tháng để SSCare hỗ trợ tốt nhất""</w:t>
+        <w:t xml:space="preserve">+ Nếu có ít nhất 1 trong 3 tháng gần nhất là "Chưa có dữ liệu" thì hiển thị "Chưa có </w:t>
+      </w:r>
+      <w:r>
+        <w:rPr>
+          <w:sz w:val="24"/>
+          <w:szCs w:val="24"/>
+        </w:rPr>
+        <w:t xml:space="preserve">đủ </w:t>
+      </w:r>
+      <w:r>
+        <w:rPr>
+          <w:sz w:val="24"/>
+          <w:szCs w:val="24"/>
+        </w:rPr>
+        <w:t xml:space="preserve">dữ liệu để đánh giá. </w:t>
+      </w:r>
+      <w:r>
+        <w:rPr>
+          <w:sz w:val="24"/>
+          <w:szCs w:val="24"/>
+        </w:rPr>
+        <w:t>Phụ huynh cần nhập thông tin</w:t>
+      </w:r>
+      <w:r>
+        <w:rPr>
+          <w:sz w:val="24"/>
+          <w:szCs w:val="24"/>
+        </w:rPr>
+        <w:t xml:space="preserve"> đầy đủ trong 3 tháng để SSCare hỗ trợ tốt nhất""</w:t>
       </w:r>
     </w:p>
     <w:p>
@@ -9957,7 +10442,6 @@
           <w:sz w:val="24"/>
           <w:szCs w:val="24"/>
         </w:rPr>
-        <w:lastRenderedPageBreak/>
         <w:t>+ Nếu có ít nhất 1 tháng trong 3 tháng gần nhất là "Không", hiển thị "Chưa ổn định (bình thường ở độ tuổi này)”</w:t>
       </w:r>
     </w:p>
@@ -10034,7 +10518,7 @@
         </w:rPr>
         <w:t xml:space="preserve"> </w:t>
       </w:r>
-      <w:bookmarkStart w:id="5" w:name="_Hlk223687723"/>
+      <w:bookmarkStart w:id="8" w:name="_Hlk223687723"/>
       <w:r>
         <w:rPr>
           <w:rFonts w:eastAsia="Times New Roman" w:cs="Times New Roman"/>
@@ -10046,92 +10530,729 @@
         </w:rPr>
         <w:t xml:space="preserve">Tình trạng cơ thể </w:t>
       </w:r>
-      <w:bookmarkEnd w:id="5"/>
+      <w:bookmarkEnd w:id="8"/>
     </w:p>
     <w:p>
       <w:pPr>
-        <w:spacing w:before="100" w:beforeAutospacing="1" w:after="100" w:afterAutospacing="1" w:line="240" w:lineRule="auto"/>
-        <w:jc w:val="left"/>
-        <w:outlineLvl w:val="2"/>
+        <w:rPr>
+          <w:sz w:val="24"/>
+          <w:szCs w:val="24"/>
+        </w:rPr>
+      </w:pPr>
+      <w:r>
+        <w:rPr>
+          <w:sz w:val="24"/>
+          <w:szCs w:val="24"/>
+        </w:rPr>
+        <w:t xml:space="preserve">- </w:t>
+      </w:r>
+      <w:r>
+        <w:rPr>
+          <w:sz w:val="24"/>
+          <w:szCs w:val="24"/>
+        </w:rPr>
+        <w:t xml:space="preserve">Ngày gần nhất </w:t>
+      </w:r>
+      <w:r>
+        <w:rPr>
+          <w:sz w:val="24"/>
+          <w:szCs w:val="24"/>
+        </w:rPr>
+        <w:t>cập nhật thông tin</w:t>
+      </w:r>
+      <w:r>
+        <w:rPr>
+          <w:sz w:val="24"/>
+          <w:szCs w:val="24"/>
+        </w:rPr>
+        <w:t>: ngày… tháng… năm…</w:t>
+      </w:r>
+    </w:p>
+    <w:p>
+      <w:pPr>
+        <w:rPr>
+          <w:sz w:val="24"/>
+          <w:szCs w:val="24"/>
+        </w:rPr>
+      </w:pPr>
+      <w:r>
+        <w:rPr>
+          <w:sz w:val="24"/>
+          <w:szCs w:val="24"/>
+        </w:rPr>
+        <w:t xml:space="preserve">- Kết luận cảnh báo: </w:t>
+      </w:r>
+      <w:r>
+        <w:rPr>
+          <w:sz w:val="24"/>
+          <w:szCs w:val="24"/>
+        </w:rPr>
+        <w:t>hiển thị theo thứ tự logic sau:</w:t>
+      </w:r>
+    </w:p>
+    <w:p>
+      <w:pPr>
+        <w:rPr>
+          <w:sz w:val="24"/>
+          <w:szCs w:val="24"/>
+        </w:rPr>
+      </w:pPr>
+      <w:r>
+        <w:rPr>
+          <w:sz w:val="24"/>
+          <w:szCs w:val="24"/>
+        </w:rPr>
+        <w:t>+ Nếu có ít nhất 1 trạng thái thuộc nhóm Cần theo dõi</w:t>
+      </w:r>
+      <w:r>
+        <w:rPr>
+          <w:sz w:val="24"/>
+          <w:szCs w:val="24"/>
+        </w:rPr>
+        <w:t xml:space="preserve"> thuộc 1 trong các trạng thái:</w:t>
+      </w:r>
+      <w:r>
+        <w:t xml:space="preserve"> </w:t>
+      </w:r>
+      <w:r>
+        <w:rPr>
+          <w:sz w:val="24"/>
+          <w:szCs w:val="24"/>
+        </w:rPr>
+        <w:t>Chán, mệt</w:t>
+      </w:r>
+      <w:r>
+        <w:rPr>
+          <w:sz w:val="24"/>
+          <w:szCs w:val="24"/>
+        </w:rPr>
+        <w:t xml:space="preserve">, </w:t>
+      </w:r>
+      <w:r>
+        <w:rPr>
+          <w:sz w:val="24"/>
+          <w:szCs w:val="24"/>
+        </w:rPr>
+        <w:t>Buồn</w:t>
+      </w:r>
+      <w:r>
+        <w:rPr>
+          <w:sz w:val="24"/>
+          <w:szCs w:val="24"/>
+        </w:rPr>
+        <w:t xml:space="preserve">, </w:t>
+      </w:r>
+      <w:r>
+        <w:rPr>
+          <w:sz w:val="24"/>
+          <w:szCs w:val="24"/>
+        </w:rPr>
+        <w:t>Cáu</w:t>
+      </w:r>
+      <w:r>
+        <w:rPr>
+          <w:sz w:val="24"/>
+          <w:szCs w:val="24"/>
+        </w:rPr>
+        <w:t xml:space="preserve">, </w:t>
+      </w:r>
+      <w:r>
+        <w:rPr>
+          <w:sz w:val="24"/>
+          <w:szCs w:val="24"/>
+        </w:rPr>
+        <w:t>Lo lắng</w:t>
+      </w:r>
+      <w:r>
+        <w:rPr>
+          <w:sz w:val="24"/>
+          <w:szCs w:val="24"/>
+        </w:rPr>
+        <w:t xml:space="preserve">, </w:t>
+      </w:r>
+      <w:r>
+        <w:rPr>
+          <w:sz w:val="24"/>
+          <w:szCs w:val="24"/>
+        </w:rPr>
+        <w:t>Uể oải</w:t>
+      </w:r>
+      <w:r>
+        <w:rPr>
+          <w:sz w:val="24"/>
+          <w:szCs w:val="24"/>
+        </w:rPr>
+        <w:t xml:space="preserve"> </w:t>
+      </w:r>
+      <w:r>
+        <w:rPr>
+          <w:sz w:val="24"/>
+          <w:szCs w:val="24"/>
+        </w:rPr>
+        <w:t xml:space="preserve">, </w:t>
+      </w:r>
+      <w:r>
         <w:rPr>
           <w:rFonts w:eastAsia="Times New Roman" w:cs="Times New Roman"/>
+          <w:sz w:val="24"/>
+          <w:szCs w:val="24"/>
+        </w:rPr>
+        <w:t>Căng tức</w:t>
+      </w:r>
+      <w:r>
+        <w:rPr>
+          <w:rFonts w:eastAsia="Times New Roman" w:cs="Times New Roman"/>
+          <w:sz w:val="24"/>
+          <w:szCs w:val="24"/>
+        </w:rPr>
+        <w:t xml:space="preserve">, </w:t>
+      </w:r>
+      <w:r>
+        <w:rPr>
+          <w:rFonts w:eastAsia="Times New Roman" w:cs="Times New Roman"/>
+          <w:sz w:val="24"/>
+          <w:szCs w:val="24"/>
+        </w:rPr>
+        <w:t>Mệt</w:t>
+      </w:r>
+      <w:r>
+        <w:rPr>
+          <w:rFonts w:eastAsia="Times New Roman" w:cs="Times New Roman"/>
+          <w:sz w:val="24"/>
+          <w:szCs w:val="24"/>
+        </w:rPr>
+        <w:t xml:space="preserve">, </w:t>
+      </w:r>
+      <w:r>
+        <w:rPr>
+          <w:rFonts w:eastAsia="Times New Roman" w:cs="Times New Roman"/>
+          <w:sz w:val="24"/>
+          <w:szCs w:val="24"/>
+        </w:rPr>
+        <w:t>Đau đầu</w:t>
+      </w:r>
+      <w:r>
+        <w:rPr>
+          <w:rFonts w:eastAsia="Times New Roman" w:cs="Times New Roman"/>
+          <w:sz w:val="24"/>
+          <w:szCs w:val="24"/>
+        </w:rPr>
+        <w:t xml:space="preserve">, </w:t>
+      </w:r>
+      <w:r>
+        <w:rPr>
+          <w:rFonts w:eastAsia="Times New Roman" w:cs="Times New Roman"/>
+          <w:sz w:val="24"/>
+          <w:szCs w:val="24"/>
+        </w:rPr>
+        <w:t>Đau bụng</w:t>
+      </w:r>
+      <w:r>
+        <w:rPr>
+          <w:rFonts w:eastAsia="Times New Roman" w:cs="Times New Roman"/>
+          <w:sz w:val="24"/>
+          <w:szCs w:val="24"/>
+        </w:rPr>
+        <w:t xml:space="preserve">, </w:t>
+      </w:r>
+      <w:r>
+        <w:rPr>
+          <w:rFonts w:eastAsia="Times New Roman" w:cs="Times New Roman"/>
+          <w:sz w:val="24"/>
+          <w:szCs w:val="24"/>
+        </w:rPr>
+        <w:t>Đau lưng</w:t>
+      </w:r>
+      <w:r>
+        <w:rPr>
+          <w:rFonts w:eastAsia="Times New Roman" w:cs="Times New Roman"/>
+          <w:sz w:val="24"/>
+          <w:szCs w:val="24"/>
+        </w:rPr>
+        <w:t xml:space="preserve">, </w:t>
+      </w:r>
+      <w:r>
+        <w:rPr>
+          <w:rFonts w:eastAsia="Times New Roman" w:cs="Times New Roman"/>
+          <w:sz w:val="24"/>
+          <w:szCs w:val="24"/>
+        </w:rPr>
+        <w:t>Buồn nôn</w:t>
+      </w:r>
+      <w:r>
+        <w:rPr>
+          <w:rFonts w:eastAsia="Times New Roman" w:cs="Times New Roman"/>
+          <w:sz w:val="24"/>
+          <w:szCs w:val="24"/>
+        </w:rPr>
+        <w:t xml:space="preserve">, </w:t>
+      </w:r>
+      <w:r>
+        <w:rPr>
+          <w:rFonts w:eastAsia="Times New Roman" w:cs="Times New Roman"/>
+          <w:sz w:val="24"/>
+          <w:szCs w:val="24"/>
+        </w:rPr>
+        <w:t>Chóng mặt</w:t>
+      </w:r>
+      <w:r>
+        <w:rPr>
+          <w:rFonts w:eastAsia="Times New Roman" w:cs="Times New Roman"/>
+          <w:sz w:val="24"/>
+          <w:szCs w:val="24"/>
+        </w:rPr>
+        <w:t xml:space="preserve">, </w:t>
+      </w:r>
+      <w:r>
+        <w:rPr>
+          <w:rFonts w:eastAsia="Times New Roman" w:cs="Times New Roman"/>
+          <w:sz w:val="24"/>
+          <w:szCs w:val="24"/>
+        </w:rPr>
+        <w:t>Nổi mụn</w:t>
+      </w:r>
+      <w:r>
+        <w:rPr>
+          <w:rFonts w:eastAsia="Times New Roman" w:cs="Times New Roman"/>
+          <w:sz w:val="24"/>
+          <w:szCs w:val="24"/>
+        </w:rPr>
+        <w:t xml:space="preserve">, </w:t>
+      </w:r>
+      <w:r>
+        <w:rPr>
+          <w:rFonts w:eastAsia="Times New Roman" w:cs="Times New Roman"/>
+          <w:sz w:val="24"/>
+          <w:szCs w:val="24"/>
+        </w:rPr>
+        <w:t>Khó chịu</w:t>
+      </w:r>
+      <w:r>
+        <w:rPr>
+          <w:rFonts w:eastAsia="Times New Roman" w:cs="Times New Roman"/>
+          <w:sz w:val="24"/>
+          <w:szCs w:val="24"/>
+        </w:rPr>
+        <w:t>,</w:t>
+      </w:r>
+      <w:r>
+        <w:rPr>
+          <w:sz w:val="24"/>
+          <w:szCs w:val="24"/>
+        </w:rPr>
+        <w:t xml:space="preserve"> </w:t>
+      </w:r>
+      <w:r>
+        <w:rPr>
+          <w:sz w:val="24"/>
+          <w:szCs w:val="24"/>
+        </w:rPr>
+        <w:t xml:space="preserve">hiển thị: </w:t>
+      </w:r>
+      <w:r>
+        <w:rPr>
           <w:b/>
-          <w:bCs/>
-          <w:sz w:val="24"/>
-          <w:szCs w:val="24"/>
-        </w:rPr>
-      </w:pPr>
-      <w:r>
-        <w:rPr>
-          <w:rFonts w:eastAsia="Times New Roman" w:cs="Times New Roman"/>
+          <w:i/>
+          <w:sz w:val="24"/>
+          <w:szCs w:val="24"/>
+        </w:rPr>
+        <w:t xml:space="preserve">Con </w:t>
+      </w:r>
+      <w:r>
+        <w:rPr>
           <w:b/>
-          <w:bCs/>
-          <w:sz w:val="24"/>
-          <w:szCs w:val="24"/>
-        </w:rPr>
-        <w:t xml:space="preserve">Ngày gần nhất </w:t>
-      </w:r>
-      <w:r>
-        <w:rPr>
-          <w:rFonts w:eastAsia="Times New Roman" w:cs="Times New Roman"/>
+          <w:i/>
+          <w:sz w:val="24"/>
+          <w:szCs w:val="24"/>
+        </w:rPr>
+        <w:t>đang gặp tình trạng</w:t>
+      </w:r>
+      <w:r>
+        <w:rPr>
           <w:b/>
-          <w:bCs/>
-          <w:sz w:val="24"/>
-          <w:szCs w:val="24"/>
-        </w:rPr>
-        <w:t>bố mẹ cập nhật thông tin</w:t>
-      </w:r>
-      <w:r>
-        <w:rPr>
-          <w:rFonts w:eastAsia="Times New Roman" w:cs="Times New Roman"/>
+          <w:i/>
+          <w:sz w:val="24"/>
+          <w:szCs w:val="24"/>
+        </w:rPr>
+        <w:t xml:space="preserve"> “trạng thái 1” và “trạng thái 2” trong các ngày gần đây</w:t>
+      </w:r>
+      <w:r>
+        <w:rPr>
+          <w:sz w:val="24"/>
+          <w:szCs w:val="24"/>
+        </w:rPr>
+        <w:t xml:space="preserve">. </w:t>
+      </w:r>
+      <w:r>
+        <w:rPr>
+          <w:sz w:val="24"/>
+          <w:szCs w:val="24"/>
+        </w:rPr>
+        <w:t xml:space="preserve">Trạng thái 1 và 2 được xác định là 2 trạng thái đầu tiên trong bảng tổng hợp </w:t>
+      </w:r>
+      <w:r>
+        <w:rPr>
+          <w:sz w:val="24"/>
+          <w:szCs w:val="24"/>
+        </w:rPr>
+        <w:t>dưới đây. Trường hợp chỉ có 1 trạng thái trong bảng tổng hợp thì bỏ cụm “và trạng thái 2”.</w:t>
+      </w:r>
+    </w:p>
+    <w:p>
+      <w:pPr>
+        <w:rPr>
+          <w:sz w:val="24"/>
+          <w:szCs w:val="24"/>
+        </w:rPr>
+      </w:pPr>
+      <w:r>
+        <w:rPr>
+          <w:sz w:val="24"/>
+          <w:szCs w:val="24"/>
+        </w:rPr>
+        <w:t xml:space="preserve">+ </w:t>
+      </w:r>
+      <w:r>
+        <w:rPr>
+          <w:sz w:val="24"/>
+          <w:szCs w:val="24"/>
+        </w:rPr>
+        <w:t>Nếu nhóm Cần theo dõi chỉ có</w:t>
+      </w:r>
+      <w:r>
+        <w:rPr>
+          <w:sz w:val="24"/>
+          <w:szCs w:val="24"/>
+        </w:rPr>
+        <w:t xml:space="preserve"> trạng thái “Khác”, hiển thị: </w:t>
+      </w:r>
+      <w:bookmarkStart w:id="9" w:name="_GoBack"/>
+      <w:r>
+        <w:rPr>
           <w:b/>
-          <w:bCs/>
-          <w:sz w:val="24"/>
-          <w:szCs w:val="24"/>
-        </w:rPr>
-        <w:t>: ngày… tháng… năm…</w:t>
+          <w:i/>
+          <w:sz w:val="24"/>
+          <w:szCs w:val="24"/>
+        </w:rPr>
+        <w:t>“Phụ huynh cần chia sẻ thêm với con về vấn đề con đang gặp”</w:t>
+      </w:r>
+      <w:bookmarkEnd w:id="9"/>
+    </w:p>
+    <w:p>
+      <w:pPr>
+        <w:rPr>
+          <w:b/>
+          <w:i/>
+          <w:sz w:val="24"/>
+          <w:szCs w:val="24"/>
+        </w:rPr>
+      </w:pPr>
+      <w:r>
+        <w:rPr>
+          <w:sz w:val="24"/>
+          <w:szCs w:val="24"/>
+        </w:rPr>
+        <w:t xml:space="preserve">+ </w:t>
+      </w:r>
+      <w:r>
+        <w:rPr>
+          <w:sz w:val="24"/>
+          <w:szCs w:val="24"/>
+        </w:rPr>
+        <w:t>Nếu</w:t>
+      </w:r>
+      <w:r>
+        <w:rPr>
+          <w:sz w:val="24"/>
+          <w:szCs w:val="24"/>
+        </w:rPr>
+        <w:t xml:space="preserve"> nhóm</w:t>
+      </w:r>
+      <w:r>
+        <w:rPr>
+          <w:sz w:val="24"/>
+          <w:szCs w:val="24"/>
+        </w:rPr>
+        <w:t xml:space="preserve"> Cần theo dõi </w:t>
+      </w:r>
+      <w:r>
+        <w:rPr>
+          <w:sz w:val="24"/>
+          <w:szCs w:val="24"/>
+        </w:rPr>
+        <w:t>chỉ có 1</w:t>
+      </w:r>
+      <w:r>
+        <w:rPr>
+          <w:sz w:val="24"/>
+          <w:szCs w:val="24"/>
+        </w:rPr>
+        <w:t xml:space="preserve"> hoặc chỉ có 2</w:t>
+      </w:r>
+      <w:r>
+        <w:rPr>
+          <w:sz w:val="24"/>
+          <w:szCs w:val="24"/>
+        </w:rPr>
+        <w:t xml:space="preserve"> trong 2 </w:t>
+      </w:r>
+      <w:r>
+        <w:rPr>
+          <w:sz w:val="24"/>
+          <w:szCs w:val="24"/>
+        </w:rPr>
+        <w:t>trạng thái</w:t>
+      </w:r>
+      <w:r>
+        <w:rPr>
+          <w:sz w:val="24"/>
+          <w:szCs w:val="24"/>
+        </w:rPr>
+        <w:t xml:space="preserve"> (không có trạng thái nào khác)</w:t>
+      </w:r>
+      <w:r>
+        <w:rPr>
+          <w:sz w:val="24"/>
+          <w:szCs w:val="24"/>
+        </w:rPr>
+        <w:t>:</w:t>
+      </w:r>
+      <w:r>
+        <w:rPr>
+          <w:sz w:val="24"/>
+          <w:szCs w:val="24"/>
+        </w:rPr>
+        <w:t xml:space="preserve"> </w:t>
+      </w:r>
+      <w:r>
+        <w:rPr>
+          <w:sz w:val="24"/>
+          <w:szCs w:val="24"/>
+        </w:rPr>
+        <w:t>Không có dữ liệu cơ thể</w:t>
+      </w:r>
+      <w:r>
+        <w:rPr>
+          <w:sz w:val="24"/>
+          <w:szCs w:val="24"/>
+        </w:rPr>
+        <w:t xml:space="preserve">, </w:t>
+      </w:r>
+      <w:r>
+        <w:rPr>
+          <w:sz w:val="24"/>
+          <w:szCs w:val="24"/>
+        </w:rPr>
+        <w:t>Không có dữ liệu cảm xúc</w:t>
+      </w:r>
+      <w:r>
+        <w:rPr>
+          <w:sz w:val="24"/>
+          <w:szCs w:val="24"/>
+        </w:rPr>
+        <w:t xml:space="preserve">, hiển thị: </w:t>
+      </w:r>
+      <w:r>
+        <w:rPr>
+          <w:b/>
+          <w:i/>
+          <w:sz w:val="24"/>
+          <w:szCs w:val="24"/>
+        </w:rPr>
+        <w:t>Chưa có đủ dữ liệu để đánh giá, phụ huynh cần cập nhật tại Mục Hiểu con</w:t>
+      </w:r>
+    </w:p>
+    <w:p>
+      <w:pPr>
+        <w:rPr>
+          <w:sz w:val="24"/>
+          <w:szCs w:val="24"/>
+        </w:rPr>
+      </w:pPr>
+      <w:r>
+        <w:rPr>
+          <w:sz w:val="24"/>
+          <w:szCs w:val="24"/>
+        </w:rPr>
+        <w:t xml:space="preserve">+ </w:t>
+      </w:r>
+      <w:r>
+        <w:rPr>
+          <w:sz w:val="24"/>
+          <w:szCs w:val="24"/>
+        </w:rPr>
+        <w:t xml:space="preserve">Trường hợp còn lại hiển thị: </w:t>
+      </w:r>
+      <w:r>
+        <w:rPr>
+          <w:b/>
+          <w:i/>
+          <w:sz w:val="24"/>
+          <w:szCs w:val="24"/>
+        </w:rPr>
+        <w:t>C</w:t>
+      </w:r>
+      <w:r>
+        <w:rPr>
+          <w:b/>
+          <w:i/>
+          <w:sz w:val="24"/>
+          <w:szCs w:val="24"/>
+        </w:rPr>
+        <w:t xml:space="preserve">hưa phát hiện </w:t>
+      </w:r>
+      <w:r>
+        <w:rPr>
+          <w:b/>
+          <w:i/>
+          <w:sz w:val="24"/>
+          <w:szCs w:val="24"/>
+        </w:rPr>
+        <w:t>dấu hiệu bất thường</w:t>
+      </w:r>
+      <w:r>
+        <w:rPr>
+          <w:b/>
+          <w:i/>
+          <w:sz w:val="24"/>
+          <w:szCs w:val="24"/>
+        </w:rPr>
+        <w:t xml:space="preserve"> của con</w:t>
+      </w:r>
+    </w:p>
+    <w:p>
+      <w:pPr>
+        <w:rPr>
+          <w:sz w:val="24"/>
+          <w:szCs w:val="24"/>
+        </w:rPr>
+      </w:pPr>
+      <w:r>
+        <w:rPr>
+          <w:sz w:val="24"/>
+          <w:szCs w:val="24"/>
+        </w:rPr>
+        <w:lastRenderedPageBreak/>
+        <w:t>Số ngày của trạng thái = số ngày check in</w:t>
+      </w:r>
+      <w:r>
+        <w:rPr>
+          <w:sz w:val="24"/>
+          <w:szCs w:val="24"/>
+        </w:rPr>
+        <w:t xml:space="preserve"> trạng thái</w:t>
+      </w:r>
+      <w:r>
+        <w:rPr>
+          <w:sz w:val="24"/>
+          <w:szCs w:val="24"/>
+        </w:rPr>
+        <w:t xml:space="preserve"> trong 30 ngày gần nhất, tính từ ngày today-1</w:t>
+      </w:r>
+    </w:p>
+    <w:p>
+      <w:pPr>
+        <w:rPr>
+          <w:sz w:val="24"/>
+          <w:szCs w:val="24"/>
+        </w:rPr>
+      </w:pPr>
+      <w:r>
+        <w:rPr>
+          <w:sz w:val="24"/>
+          <w:szCs w:val="24"/>
+        </w:rPr>
+        <w:t>Số ngày của trạng thái “không có dữ liệu cơ thể” = 30 – ngày có dữ liệu check in cơ thể</w:t>
+      </w:r>
+    </w:p>
+    <w:p>
+      <w:pPr>
+        <w:rPr>
+          <w:sz w:val="24"/>
+          <w:szCs w:val="24"/>
+        </w:rPr>
+      </w:pPr>
+      <w:r>
+        <w:rPr>
+          <w:sz w:val="24"/>
+          <w:szCs w:val="24"/>
+        </w:rPr>
+        <w:t>Số ngày của trạng thái “không có dữ liệu c</w:t>
+      </w:r>
+      <w:r>
+        <w:rPr>
+          <w:sz w:val="24"/>
+          <w:szCs w:val="24"/>
+        </w:rPr>
+        <w:t>ảm xúc</w:t>
+      </w:r>
+      <w:r>
+        <w:rPr>
+          <w:sz w:val="24"/>
+          <w:szCs w:val="24"/>
+        </w:rPr>
+        <w:t xml:space="preserve">” = 30 – ngày có dữ liệu check in </w:t>
+      </w:r>
+      <w:r>
+        <w:rPr>
+          <w:sz w:val="24"/>
+          <w:szCs w:val="24"/>
+        </w:rPr>
+        <w:t>cảm xúc</w:t>
+      </w:r>
+    </w:p>
+    <w:p>
+      <w:pPr>
+        <w:rPr>
+          <w:sz w:val="24"/>
+          <w:szCs w:val="24"/>
+        </w:rPr>
+      </w:pPr>
+      <w:r>
+        <w:rPr>
+          <w:sz w:val="24"/>
+          <w:szCs w:val="24"/>
+        </w:rPr>
+        <w:t>Hiển thị: số ngày của trạng thái/số ngày của tháng</w:t>
+      </w:r>
+      <w:r>
+        <w:rPr>
+          <w:sz w:val="24"/>
+          <w:szCs w:val="24"/>
+        </w:rPr>
+        <w:t>. Các trạng thái không có thông tin thì không hiển thị,</w:t>
+      </w:r>
+      <w:r>
+        <w:rPr>
+          <w:sz w:val="24"/>
+          <w:szCs w:val="24"/>
+        </w:rPr>
+        <w:t xml:space="preserve"> chia làm 2 loại như sau:</w:t>
       </w:r>
     </w:p>
     <w:tbl>
       <w:tblPr>
+        <w:tblStyle w:val="TableGrid"/>
         <w:tblW w:w="0" w:type="auto"/>
-        <w:tblCellSpacing w:w="15" w:type="dxa"/>
-        <w:tblBorders>
-          <w:top w:val="single" w:sz="4" w:space="0" w:color="auto"/>
-          <w:left w:val="single" w:sz="4" w:space="0" w:color="auto"/>
-          <w:bottom w:val="single" w:sz="4" w:space="0" w:color="auto"/>
-          <w:right w:val="single" w:sz="4" w:space="0" w:color="auto"/>
-          <w:insideH w:val="single" w:sz="4" w:space="0" w:color="auto"/>
-          <w:insideV w:val="single" w:sz="4" w:space="0" w:color="auto"/>
-        </w:tblBorders>
-        <w:tblCellMar>
-          <w:top w:w="15" w:type="dxa"/>
-          <w:left w:w="15" w:type="dxa"/>
-          <w:bottom w:w="15" w:type="dxa"/>
-          <w:right w:w="15" w:type="dxa"/>
-        </w:tblCellMar>
         <w:tblLook w:val="04A0" w:firstRow="1" w:lastRow="0" w:firstColumn="1" w:lastColumn="0" w:noHBand="0" w:noVBand="1"/>
       </w:tblPr>
       <w:tblGrid>
-        <w:gridCol w:w="1720"/>
-        <w:gridCol w:w="7631"/>
+        <w:gridCol w:w="1748"/>
+        <w:gridCol w:w="1692"/>
+        <w:gridCol w:w="3111"/>
+        <w:gridCol w:w="2843"/>
       </w:tblGrid>
       <w:tr>
-        <w:trPr>
-          <w:trHeight w:val="201"/>
-          <w:tblHeader/>
-          <w:tblCellSpacing w:w="15" w:type="dxa"/>
-        </w:trPr>
-        <w:tc>
-          <w:tcPr>
-            <w:tcW w:w="1675" w:type="dxa"/>
-            <w:vAlign w:val="center"/>
-            <w:hideMark/>
-          </w:tcPr>
-          <w:p>
-            <w:pPr>
-              <w:spacing w:after="0" w:line="240" w:lineRule="auto"/>
-              <w:jc w:val="center"/>
+        <w:tc>
+          <w:tcPr>
+            <w:tcW w:w="3440" w:type="dxa"/>
+            <w:gridSpan w:val="2"/>
+          </w:tcPr>
+          <w:p>
+            <w:pPr>
+              <w:spacing w:before="100" w:beforeAutospacing="1" w:after="100" w:afterAutospacing="1" w:line="240" w:lineRule="auto"/>
+              <w:jc w:val="left"/>
+              <w:outlineLvl w:val="2"/>
               <w:rPr>
                 <w:rFonts w:eastAsia="Times New Roman" w:cs="Times New Roman"/>
                 <w:b/>
@@ -10148,18 +11269,20 @@
                 <w:sz w:val="24"/>
                 <w:szCs w:val="24"/>
               </w:rPr>
-              <w:t>Trạng thái</w:t>
-            </w:r>
-          </w:p>
-        </w:tc>
-        <w:tc>
-          <w:tcPr>
-            <w:tcW w:w="7586" w:type="dxa"/>
-          </w:tcPr>
-          <w:p>
-            <w:pPr>
-              <w:spacing w:after="0" w:line="240" w:lineRule="auto"/>
-              <w:jc w:val="center"/>
+              <w:t>Bình thường</w:t>
+            </w:r>
+          </w:p>
+        </w:tc>
+        <w:tc>
+          <w:tcPr>
+            <w:tcW w:w="5954" w:type="dxa"/>
+            <w:gridSpan w:val="2"/>
+          </w:tcPr>
+          <w:p>
+            <w:pPr>
+              <w:spacing w:before="100" w:beforeAutospacing="1" w:after="100" w:afterAutospacing="1" w:line="240" w:lineRule="auto"/>
+              <w:jc w:val="left"/>
+              <w:outlineLvl w:val="2"/>
               <w:rPr>
                 <w:rFonts w:eastAsia="Times New Roman" w:cs="Times New Roman"/>
                 <w:b/>
@@ -10176,724 +11299,1612 @@
                 <w:sz w:val="24"/>
                 <w:szCs w:val="24"/>
               </w:rPr>
-              <w:t>Ngày</w:t>
+              <w:t>Cần theo dõi</w:t>
+            </w:r>
+          </w:p>
+          <w:p>
+            <w:pPr>
+              <w:spacing w:before="100" w:beforeAutospacing="1" w:after="100" w:afterAutospacing="1" w:line="240" w:lineRule="auto"/>
+              <w:jc w:val="left"/>
+              <w:outlineLvl w:val="2"/>
+              <w:rPr>
+                <w:rFonts w:eastAsia="Times New Roman" w:cs="Times New Roman"/>
+                <w:bCs/>
+                <w:sz w:val="24"/>
+                <w:szCs w:val="24"/>
+              </w:rPr>
+            </w:pPr>
+            <w:r>
+              <w:rPr>
+                <w:rFonts w:eastAsia="Times New Roman" w:cs="Times New Roman"/>
+                <w:bCs/>
+                <w:sz w:val="24"/>
+                <w:szCs w:val="24"/>
+              </w:rPr>
+              <w:t xml:space="preserve">Trong đó trạng thái cần theo dõi hiển thị 3 trạng thái có số lượng </w:t>
+            </w:r>
+            <w:r>
+              <w:rPr>
+                <w:rFonts w:eastAsia="Times New Roman" w:cs="Times New Roman"/>
+                <w:bCs/>
+                <w:sz w:val="24"/>
+                <w:szCs w:val="24"/>
+              </w:rPr>
+              <w:t>ngày nhiều nhất. Trường hợp có số lượng ngày bằng nhau, chọn theo thứ tự abc</w:t>
             </w:r>
           </w:p>
         </w:tc>
       </w:tr>
       <w:tr>
-        <w:trPr>
-          <w:trHeight w:val="235"/>
-          <w:tblCellSpacing w:w="15" w:type="dxa"/>
-        </w:trPr>
-        <w:tc>
-          <w:tcPr>
-            <w:tcW w:w="1675" w:type="dxa"/>
-          </w:tcPr>
-          <w:p>
-            <w:pPr>
-              <w:spacing w:after="0" w:line="240" w:lineRule="auto"/>
-              <w:jc w:val="left"/>
-              <w:rPr>
-                <w:rFonts w:eastAsia="Times New Roman" w:cs="Times New Roman"/>
-                <w:sz w:val="24"/>
-                <w:szCs w:val="24"/>
-              </w:rPr>
-            </w:pPr>
-            <w:r>
-              <w:rPr>
-                <w:rFonts w:eastAsia="Times New Roman" w:cs="Times New Roman"/>
-                <w:sz w:val="24"/>
-                <w:szCs w:val="24"/>
-              </w:rPr>
-              <w:t>Đang trong kỳ</w:t>
-            </w:r>
-          </w:p>
-        </w:tc>
-        <w:tc>
-          <w:tcPr>
-            <w:tcW w:w="7586" w:type="dxa"/>
-          </w:tcPr>
-          <w:p>
-            <w:pPr>
-              <w:spacing w:after="0" w:line="240" w:lineRule="auto"/>
-              <w:jc w:val="left"/>
-              <w:rPr>
-                <w:rFonts w:ascii="Calibri" w:hAnsi="Calibri" w:cs="Calibri"/>
-                <w:sz w:val="24"/>
-                <w:szCs w:val="24"/>
-              </w:rPr>
-            </w:pPr>
-            <w:r>
-              <w:rPr>
-                <w:rFonts w:ascii="Segoe UI Emoji" w:hAnsi="Segoe UI Emoji" w:cs="Segoe UI Emoji"/>
-                <w:sz w:val="24"/>
-                <w:szCs w:val="24"/>
-              </w:rPr>
-              <w:t>= s</w:t>
-            </w:r>
-            <w:r>
-              <w:rPr>
-                <w:rFonts w:ascii="Calibri" w:hAnsi="Calibri" w:cs="Calibri"/>
-                <w:sz w:val="24"/>
-                <w:szCs w:val="24"/>
-              </w:rPr>
-              <w:t>ố ngày check in trong 30 ngày gần nhất, tính từ ngày today-1</w:t>
+        <w:tc>
+          <w:tcPr>
+            <w:tcW w:w="1748" w:type="dxa"/>
+          </w:tcPr>
+          <w:p>
+            <w:pPr>
+              <w:spacing w:before="100" w:beforeAutospacing="1" w:after="100" w:afterAutospacing="1" w:line="240" w:lineRule="auto"/>
+              <w:jc w:val="left"/>
+              <w:outlineLvl w:val="2"/>
+              <w:rPr>
+                <w:rFonts w:eastAsia="Times New Roman" w:cs="Times New Roman"/>
+                <w:b/>
+                <w:bCs/>
+                <w:sz w:val="24"/>
+                <w:szCs w:val="24"/>
+              </w:rPr>
+            </w:pPr>
+            <w:r>
+              <w:rPr>
+                <w:rFonts w:eastAsia="Times New Roman" w:cs="Times New Roman"/>
+                <w:b/>
+                <w:bCs/>
+                <w:sz w:val="24"/>
+                <w:szCs w:val="24"/>
+              </w:rPr>
+              <w:t>Trạng thái</w:t>
+            </w:r>
+          </w:p>
+        </w:tc>
+        <w:tc>
+          <w:tcPr>
+            <w:tcW w:w="1692" w:type="dxa"/>
+          </w:tcPr>
+          <w:p>
+            <w:pPr>
+              <w:spacing w:before="100" w:beforeAutospacing="1" w:after="100" w:afterAutospacing="1" w:line="240" w:lineRule="auto"/>
+              <w:jc w:val="left"/>
+              <w:outlineLvl w:val="2"/>
+              <w:rPr>
+                <w:rFonts w:eastAsia="Times New Roman" w:cs="Times New Roman"/>
+                <w:b/>
+                <w:bCs/>
+                <w:sz w:val="24"/>
+                <w:szCs w:val="24"/>
+              </w:rPr>
+            </w:pPr>
+            <w:r>
+              <w:rPr>
+                <w:rFonts w:eastAsia="Times New Roman" w:cs="Times New Roman"/>
+                <w:b/>
+                <w:bCs/>
+                <w:sz w:val="24"/>
+                <w:szCs w:val="24"/>
+              </w:rPr>
+              <w:t>Số ngày</w:t>
+            </w:r>
+          </w:p>
+        </w:tc>
+        <w:tc>
+          <w:tcPr>
+            <w:tcW w:w="3111" w:type="dxa"/>
+          </w:tcPr>
+          <w:p>
+            <w:pPr>
+              <w:spacing w:before="100" w:beforeAutospacing="1" w:after="100" w:afterAutospacing="1" w:line="240" w:lineRule="auto"/>
+              <w:jc w:val="left"/>
+              <w:outlineLvl w:val="2"/>
+              <w:rPr>
+                <w:rFonts w:eastAsia="Times New Roman" w:cs="Times New Roman"/>
+                <w:b/>
+                <w:bCs/>
+                <w:sz w:val="24"/>
+                <w:szCs w:val="24"/>
+              </w:rPr>
+            </w:pPr>
+            <w:r>
+              <w:rPr>
+                <w:rFonts w:eastAsia="Times New Roman" w:cs="Times New Roman"/>
+                <w:b/>
+                <w:bCs/>
+                <w:sz w:val="24"/>
+                <w:szCs w:val="24"/>
+              </w:rPr>
+              <w:t>Trạng thái</w:t>
+            </w:r>
+          </w:p>
+        </w:tc>
+        <w:tc>
+          <w:tcPr>
+            <w:tcW w:w="2843" w:type="dxa"/>
+          </w:tcPr>
+          <w:p>
+            <w:pPr>
+              <w:spacing w:before="100" w:beforeAutospacing="1" w:after="100" w:afterAutospacing="1" w:line="240" w:lineRule="auto"/>
+              <w:jc w:val="left"/>
+              <w:outlineLvl w:val="2"/>
+              <w:rPr>
+                <w:rFonts w:eastAsia="Times New Roman" w:cs="Times New Roman"/>
+                <w:b/>
+                <w:bCs/>
+                <w:sz w:val="24"/>
+                <w:szCs w:val="24"/>
+              </w:rPr>
+            </w:pPr>
+            <w:r>
+              <w:rPr>
+                <w:rFonts w:eastAsia="Times New Roman" w:cs="Times New Roman"/>
+                <w:b/>
+                <w:bCs/>
+                <w:sz w:val="24"/>
+                <w:szCs w:val="24"/>
+              </w:rPr>
+              <w:t>Số ngày</w:t>
             </w:r>
           </w:p>
         </w:tc>
       </w:tr>
       <w:tr>
-        <w:trPr>
-          <w:trHeight w:val="235"/>
-          <w:tblCellSpacing w:w="15" w:type="dxa"/>
-        </w:trPr>
-        <w:tc>
-          <w:tcPr>
-            <w:tcW w:w="1675" w:type="dxa"/>
-          </w:tcPr>
-          <w:p>
-            <w:pPr>
-              <w:spacing w:after="0" w:line="240" w:lineRule="auto"/>
-              <w:jc w:val="left"/>
-              <w:rPr>
-                <w:rFonts w:eastAsia="Times New Roman" w:cs="Times New Roman"/>
-                <w:sz w:val="24"/>
-                <w:szCs w:val="24"/>
-              </w:rPr>
-            </w:pPr>
-            <w:r>
-              <w:rPr>
-                <w:rFonts w:eastAsia="Times New Roman" w:cs="Times New Roman"/>
-                <w:sz w:val="24"/>
-                <w:szCs w:val="24"/>
-              </w:rPr>
-              <w:t>Khí hư</w:t>
-            </w:r>
-          </w:p>
-        </w:tc>
-        <w:tc>
-          <w:tcPr>
-            <w:tcW w:w="7586" w:type="dxa"/>
-          </w:tcPr>
-          <w:p>
-            <w:pPr>
-              <w:spacing w:after="0" w:line="240" w:lineRule="auto"/>
-              <w:jc w:val="left"/>
-              <w:rPr>
-                <w:rFonts w:ascii="Segoe UI Emoji" w:hAnsi="Segoe UI Emoji" w:cs="Segoe UI Emoji"/>
-                <w:sz w:val="24"/>
-                <w:szCs w:val="24"/>
-              </w:rPr>
-            </w:pPr>
-            <w:r>
-              <w:rPr>
-                <w:rFonts w:ascii="Segoe UI Emoji" w:hAnsi="Segoe UI Emoji" w:cs="Segoe UI Emoji"/>
-                <w:sz w:val="24"/>
-                <w:szCs w:val="24"/>
-              </w:rPr>
-              <w:t>= s</w:t>
-            </w:r>
-            <w:r>
-              <w:rPr>
-                <w:rFonts w:ascii="Calibri" w:hAnsi="Calibri" w:cs="Calibri"/>
-                <w:sz w:val="24"/>
-                <w:szCs w:val="24"/>
-              </w:rPr>
-              <w:t>ố ngày check in trong 30 ngày gần nhất, tính từ ngày today-1</w:t>
+        <w:tc>
+          <w:tcPr>
+            <w:tcW w:w="1748" w:type="dxa"/>
+          </w:tcPr>
+          <w:p>
+            <w:pPr>
+              <w:spacing w:before="100" w:beforeAutospacing="1" w:after="100" w:afterAutospacing="1" w:line="240" w:lineRule="auto"/>
+              <w:jc w:val="left"/>
+              <w:outlineLvl w:val="2"/>
+              <w:rPr>
+                <w:rFonts w:eastAsia="Times New Roman" w:cs="Times New Roman"/>
+                <w:b/>
+                <w:bCs/>
+                <w:sz w:val="24"/>
+                <w:szCs w:val="24"/>
+              </w:rPr>
+            </w:pPr>
+            <w:r>
+              <w:rPr>
+                <w:rFonts w:eastAsia="Times New Roman" w:cs="Times New Roman"/>
+                <w:sz w:val="24"/>
+                <w:szCs w:val="24"/>
+              </w:rPr>
+              <w:t>Khỏe</w:t>
+            </w:r>
+          </w:p>
+        </w:tc>
+        <w:tc>
+          <w:tcPr>
+            <w:tcW w:w="1692" w:type="dxa"/>
+          </w:tcPr>
+          <w:p>
+            <w:pPr>
+              <w:spacing w:before="100" w:beforeAutospacing="1" w:after="100" w:afterAutospacing="1" w:line="240" w:lineRule="auto"/>
+              <w:jc w:val="left"/>
+              <w:outlineLvl w:val="2"/>
+              <w:rPr>
+                <w:rFonts w:eastAsia="Times New Roman" w:cs="Times New Roman"/>
+                <w:bCs/>
+                <w:sz w:val="24"/>
+                <w:szCs w:val="24"/>
+              </w:rPr>
+            </w:pPr>
+            <w:r>
+              <w:rPr>
+                <w:rFonts w:eastAsia="Times New Roman" w:cs="Times New Roman"/>
+                <w:bCs/>
+                <w:sz w:val="24"/>
+                <w:szCs w:val="24"/>
+              </w:rPr>
+              <w:t>15/30 ngày</w:t>
+            </w:r>
+          </w:p>
+        </w:tc>
+        <w:tc>
+          <w:tcPr>
+            <w:tcW w:w="3111" w:type="dxa"/>
+            <w:vAlign w:val="center"/>
+          </w:tcPr>
+          <w:p>
+            <w:pPr>
+              <w:spacing w:before="100" w:beforeAutospacing="1" w:after="100" w:afterAutospacing="1" w:line="240" w:lineRule="auto"/>
+              <w:jc w:val="left"/>
+              <w:outlineLvl w:val="2"/>
+              <w:rPr>
+                <w:rFonts w:eastAsia="Times New Roman" w:cs="Times New Roman"/>
+                <w:b/>
+                <w:bCs/>
+                <w:sz w:val="24"/>
+                <w:szCs w:val="24"/>
+              </w:rPr>
+            </w:pPr>
+            <w:r>
+              <w:rPr>
+                <w:rFonts w:eastAsia="Times New Roman" w:cs="Times New Roman"/>
+                <w:sz w:val="24"/>
+                <w:szCs w:val="24"/>
+              </w:rPr>
+              <w:t>Chán, mệt</w:t>
+            </w:r>
+          </w:p>
+        </w:tc>
+        <w:tc>
+          <w:tcPr>
+            <w:tcW w:w="2843" w:type="dxa"/>
+          </w:tcPr>
+          <w:p>
+            <w:pPr>
+              <w:spacing w:before="100" w:beforeAutospacing="1" w:after="100" w:afterAutospacing="1" w:line="240" w:lineRule="auto"/>
+              <w:jc w:val="left"/>
+              <w:outlineLvl w:val="2"/>
+              <w:rPr>
+                <w:rFonts w:eastAsia="Times New Roman" w:cs="Times New Roman"/>
+                <w:sz w:val="24"/>
+                <w:szCs w:val="24"/>
+              </w:rPr>
+            </w:pPr>
+            <w:r>
+              <w:rPr>
+                <w:rFonts w:eastAsia="Times New Roman" w:cs="Times New Roman"/>
+                <w:sz w:val="24"/>
+                <w:szCs w:val="24"/>
+              </w:rPr>
+              <w:t>2/30 ngày</w:t>
             </w:r>
           </w:p>
         </w:tc>
       </w:tr>
       <w:tr>
-        <w:trPr>
-          <w:trHeight w:val="235"/>
-          <w:tblCellSpacing w:w="15" w:type="dxa"/>
-        </w:trPr>
-        <w:tc>
-          <w:tcPr>
-            <w:tcW w:w="1675" w:type="dxa"/>
-            <w:vAlign w:val="center"/>
-            <w:hideMark/>
-          </w:tcPr>
-          <w:p>
-            <w:pPr>
-              <w:spacing w:after="0" w:line="240" w:lineRule="auto"/>
-              <w:jc w:val="left"/>
-              <w:rPr>
-                <w:rFonts w:eastAsia="Times New Roman" w:cs="Times New Roman"/>
-                <w:sz w:val="24"/>
-                <w:szCs w:val="24"/>
-              </w:rPr>
-            </w:pPr>
-            <w:r>
-              <w:rPr>
-                <w:rFonts w:eastAsia="Times New Roman" w:cs="Times New Roman"/>
-                <w:sz w:val="24"/>
-                <w:szCs w:val="24"/>
-              </w:rPr>
-              <w:t>Khỏe</w:t>
-            </w:r>
-          </w:p>
-        </w:tc>
-        <w:tc>
-          <w:tcPr>
-            <w:tcW w:w="7586" w:type="dxa"/>
-          </w:tcPr>
-          <w:p>
-            <w:pPr>
-              <w:spacing w:after="0" w:line="240" w:lineRule="auto"/>
-              <w:jc w:val="left"/>
-              <w:rPr>
-                <w:rFonts w:eastAsia="Times New Roman" w:cs="Times New Roman"/>
-                <w:sz w:val="24"/>
-                <w:szCs w:val="24"/>
-              </w:rPr>
-            </w:pPr>
-            <w:r>
-              <w:rPr>
-                <w:rFonts w:ascii="Segoe UI Emoji" w:hAnsi="Segoe UI Emoji" w:cs="Segoe UI Emoji"/>
-                <w:sz w:val="24"/>
-                <w:szCs w:val="24"/>
-              </w:rPr>
-              <w:t>= s</w:t>
-            </w:r>
-            <w:r>
-              <w:rPr>
-                <w:rFonts w:ascii="Calibri" w:hAnsi="Calibri" w:cs="Calibri"/>
-                <w:sz w:val="24"/>
-                <w:szCs w:val="24"/>
-              </w:rPr>
-              <w:t>ố ngày check in trong 30 ngày gần nhất, tính từ ngày today-1</w:t>
+        <w:tc>
+          <w:tcPr>
+            <w:tcW w:w="1748" w:type="dxa"/>
+            <w:vAlign w:val="center"/>
+          </w:tcPr>
+          <w:p>
+            <w:pPr>
+              <w:spacing w:before="100" w:beforeAutospacing="1" w:after="100" w:afterAutospacing="1" w:line="240" w:lineRule="auto"/>
+              <w:jc w:val="left"/>
+              <w:outlineLvl w:val="2"/>
+              <w:rPr>
+                <w:rFonts w:eastAsia="Times New Roman" w:cs="Times New Roman"/>
+                <w:b/>
+                <w:bCs/>
+                <w:sz w:val="24"/>
+                <w:szCs w:val="24"/>
+              </w:rPr>
+            </w:pPr>
+            <w:r>
+              <w:rPr>
+                <w:rFonts w:eastAsia="Times New Roman" w:cs="Times New Roman"/>
+                <w:sz w:val="24"/>
+                <w:szCs w:val="24"/>
+              </w:rPr>
+              <w:t>Vui, hào hứng</w:t>
+            </w:r>
+          </w:p>
+        </w:tc>
+        <w:tc>
+          <w:tcPr>
+            <w:tcW w:w="1692" w:type="dxa"/>
+            <w:vAlign w:val="center"/>
+          </w:tcPr>
+          <w:p>
+            <w:pPr>
+              <w:spacing w:before="100" w:beforeAutospacing="1" w:after="100" w:afterAutospacing="1" w:line="240" w:lineRule="auto"/>
+              <w:jc w:val="left"/>
+              <w:outlineLvl w:val="2"/>
+              <w:rPr>
+                <w:rFonts w:eastAsia="Times New Roman" w:cs="Times New Roman"/>
+                <w:bCs/>
+                <w:sz w:val="24"/>
+                <w:szCs w:val="24"/>
+              </w:rPr>
+            </w:pPr>
+            <w:r>
+              <w:rPr>
+                <w:rFonts w:eastAsia="Times New Roman" w:cs="Times New Roman"/>
+                <w:bCs/>
+                <w:sz w:val="24"/>
+                <w:szCs w:val="24"/>
+              </w:rPr>
+              <w:t>…</w:t>
+            </w:r>
+          </w:p>
+        </w:tc>
+        <w:tc>
+          <w:tcPr>
+            <w:tcW w:w="3111" w:type="dxa"/>
+            <w:vAlign w:val="center"/>
+          </w:tcPr>
+          <w:p>
+            <w:pPr>
+              <w:spacing w:before="100" w:beforeAutospacing="1" w:after="100" w:afterAutospacing="1" w:line="240" w:lineRule="auto"/>
+              <w:jc w:val="left"/>
+              <w:outlineLvl w:val="2"/>
+              <w:rPr>
+                <w:rFonts w:eastAsia="Times New Roman" w:cs="Times New Roman"/>
+                <w:b/>
+                <w:bCs/>
+                <w:sz w:val="24"/>
+                <w:szCs w:val="24"/>
+              </w:rPr>
+            </w:pPr>
+            <w:r>
+              <w:rPr>
+                <w:rFonts w:eastAsia="Times New Roman" w:cs="Times New Roman"/>
+                <w:sz w:val="24"/>
+                <w:szCs w:val="24"/>
+              </w:rPr>
+              <w:t>Buồn</w:t>
+            </w:r>
+          </w:p>
+        </w:tc>
+        <w:tc>
+          <w:tcPr>
+            <w:tcW w:w="2843" w:type="dxa"/>
+          </w:tcPr>
+          <w:p>
+            <w:pPr>
+              <w:spacing w:before="100" w:beforeAutospacing="1" w:after="100" w:afterAutospacing="1" w:line="240" w:lineRule="auto"/>
+              <w:jc w:val="left"/>
+              <w:outlineLvl w:val="2"/>
+              <w:rPr>
+                <w:rFonts w:eastAsia="Times New Roman" w:cs="Times New Roman"/>
+                <w:sz w:val="24"/>
+                <w:szCs w:val="24"/>
+              </w:rPr>
+            </w:pPr>
+            <w:r>
+              <w:rPr>
+                <w:rFonts w:eastAsia="Times New Roman" w:cs="Times New Roman"/>
+                <w:sz w:val="24"/>
+                <w:szCs w:val="24"/>
+              </w:rPr>
+              <w:t>…</w:t>
             </w:r>
           </w:p>
         </w:tc>
       </w:tr>
       <w:tr>
-        <w:trPr>
-          <w:trHeight w:val="235"/>
-          <w:tblCellSpacing w:w="15" w:type="dxa"/>
-        </w:trPr>
-        <w:tc>
-          <w:tcPr>
-            <w:tcW w:w="1675" w:type="dxa"/>
-            <w:vAlign w:val="center"/>
-            <w:hideMark/>
-          </w:tcPr>
-          <w:p>
-            <w:pPr>
-              <w:spacing w:after="0" w:line="240" w:lineRule="auto"/>
-              <w:jc w:val="left"/>
-              <w:rPr>
-                <w:rFonts w:eastAsia="Times New Roman" w:cs="Times New Roman"/>
-                <w:sz w:val="24"/>
-                <w:szCs w:val="24"/>
-              </w:rPr>
-            </w:pPr>
-            <w:r>
-              <w:rPr>
-                <w:rFonts w:eastAsia="Times New Roman" w:cs="Times New Roman"/>
-                <w:sz w:val="24"/>
-                <w:szCs w:val="24"/>
-              </w:rPr>
-              <w:t>Mệt</w:t>
-            </w:r>
-          </w:p>
-        </w:tc>
-        <w:tc>
-          <w:tcPr>
-            <w:tcW w:w="7586" w:type="dxa"/>
-          </w:tcPr>
-          <w:p>
-            <w:pPr>
-              <w:spacing w:after="0" w:line="240" w:lineRule="auto"/>
-              <w:jc w:val="left"/>
-              <w:rPr>
-                <w:rFonts w:eastAsia="Times New Roman" w:cs="Times New Roman"/>
-                <w:sz w:val="24"/>
-                <w:szCs w:val="24"/>
-              </w:rPr>
-            </w:pPr>
-            <w:r>
-              <w:rPr>
-                <w:rFonts w:ascii="Segoe UI Emoji" w:hAnsi="Segoe UI Emoji" w:cs="Segoe UI Emoji"/>
-                <w:sz w:val="24"/>
-                <w:szCs w:val="24"/>
-              </w:rPr>
-              <w:t>= s</w:t>
-            </w:r>
-            <w:r>
-              <w:rPr>
-                <w:rFonts w:ascii="Calibri" w:hAnsi="Calibri" w:cs="Calibri"/>
-                <w:sz w:val="24"/>
-                <w:szCs w:val="24"/>
-              </w:rPr>
-              <w:t>ố ngày check in trong 30 ngày gần nhất, tính từ ngày today-1</w:t>
-            </w:r>
+        <w:tc>
+          <w:tcPr>
+            <w:tcW w:w="1748" w:type="dxa"/>
+            <w:vAlign w:val="center"/>
+          </w:tcPr>
+          <w:p>
+            <w:pPr>
+              <w:spacing w:before="100" w:beforeAutospacing="1" w:after="100" w:afterAutospacing="1" w:line="240" w:lineRule="auto"/>
+              <w:jc w:val="left"/>
+              <w:outlineLvl w:val="2"/>
+              <w:rPr>
+                <w:rFonts w:eastAsia="Times New Roman" w:cs="Times New Roman"/>
+                <w:b/>
+                <w:bCs/>
+                <w:sz w:val="24"/>
+                <w:szCs w:val="24"/>
+              </w:rPr>
+            </w:pPr>
+            <w:r>
+              <w:rPr>
+                <w:rFonts w:eastAsia="Times New Roman" w:cs="Times New Roman"/>
+                <w:sz w:val="24"/>
+                <w:szCs w:val="24"/>
+              </w:rPr>
+              <w:t>Bình thường</w:t>
+            </w:r>
+          </w:p>
+        </w:tc>
+        <w:tc>
+          <w:tcPr>
+            <w:tcW w:w="1692" w:type="dxa"/>
+            <w:vAlign w:val="center"/>
+          </w:tcPr>
+          <w:p>
+            <w:pPr>
+              <w:spacing w:before="100" w:beforeAutospacing="1" w:after="100" w:afterAutospacing="1" w:line="240" w:lineRule="auto"/>
+              <w:jc w:val="left"/>
+              <w:outlineLvl w:val="2"/>
+              <w:rPr>
+                <w:rFonts w:eastAsia="Times New Roman" w:cs="Times New Roman"/>
+                <w:bCs/>
+                <w:sz w:val="24"/>
+                <w:szCs w:val="24"/>
+              </w:rPr>
+            </w:pPr>
+            <w:r>
+              <w:rPr>
+                <w:rFonts w:eastAsia="Times New Roman" w:cs="Times New Roman"/>
+                <w:bCs/>
+                <w:sz w:val="24"/>
+                <w:szCs w:val="24"/>
+              </w:rPr>
+              <w:t>…</w:t>
+            </w:r>
+          </w:p>
+        </w:tc>
+        <w:tc>
+          <w:tcPr>
+            <w:tcW w:w="3111" w:type="dxa"/>
+            <w:vAlign w:val="center"/>
+          </w:tcPr>
+          <w:p>
+            <w:pPr>
+              <w:spacing w:before="100" w:beforeAutospacing="1" w:after="100" w:afterAutospacing="1" w:line="240" w:lineRule="auto"/>
+              <w:jc w:val="left"/>
+              <w:outlineLvl w:val="2"/>
+              <w:rPr>
+                <w:rFonts w:eastAsia="Times New Roman" w:cs="Times New Roman"/>
+                <w:b/>
+                <w:bCs/>
+                <w:sz w:val="24"/>
+                <w:szCs w:val="24"/>
+              </w:rPr>
+            </w:pPr>
+            <w:r>
+              <w:rPr>
+                <w:rFonts w:eastAsia="Times New Roman" w:cs="Times New Roman"/>
+                <w:sz w:val="24"/>
+                <w:szCs w:val="24"/>
+              </w:rPr>
+              <w:t>Cáu</w:t>
+            </w:r>
+          </w:p>
+        </w:tc>
+        <w:tc>
+          <w:tcPr>
+            <w:tcW w:w="2843" w:type="dxa"/>
+          </w:tcPr>
+          <w:p>
+            <w:pPr>
+              <w:spacing w:before="100" w:beforeAutospacing="1" w:after="100" w:afterAutospacing="1" w:line="240" w:lineRule="auto"/>
+              <w:jc w:val="left"/>
+              <w:outlineLvl w:val="2"/>
+              <w:rPr>
+                <w:rFonts w:eastAsia="Times New Roman" w:cs="Times New Roman"/>
+                <w:sz w:val="24"/>
+                <w:szCs w:val="24"/>
+              </w:rPr>
+            </w:pPr>
           </w:p>
         </w:tc>
       </w:tr>
       <w:tr>
-        <w:trPr>
-          <w:trHeight w:val="223"/>
-          <w:tblCellSpacing w:w="15" w:type="dxa"/>
-        </w:trPr>
-        <w:tc>
-          <w:tcPr>
-            <w:tcW w:w="1675" w:type="dxa"/>
-            <w:vAlign w:val="center"/>
-            <w:hideMark/>
-          </w:tcPr>
-          <w:p>
-            <w:pPr>
-              <w:spacing w:after="0" w:line="240" w:lineRule="auto"/>
-              <w:jc w:val="left"/>
-              <w:rPr>
-                <w:rFonts w:eastAsia="Times New Roman" w:cs="Times New Roman"/>
-                <w:sz w:val="24"/>
-                <w:szCs w:val="24"/>
-              </w:rPr>
-            </w:pPr>
-            <w:r>
-              <w:rPr>
-                <w:rFonts w:eastAsia="Times New Roman" w:cs="Times New Roman"/>
-                <w:sz w:val="24"/>
-                <w:szCs w:val="24"/>
-              </w:rPr>
-              <w:t>Đau đầu</w:t>
-            </w:r>
-          </w:p>
-        </w:tc>
-        <w:tc>
-          <w:tcPr>
-            <w:tcW w:w="7586" w:type="dxa"/>
-          </w:tcPr>
-          <w:p>
-            <w:pPr>
-              <w:spacing w:after="0" w:line="240" w:lineRule="auto"/>
-              <w:jc w:val="left"/>
-              <w:rPr>
-                <w:rFonts w:eastAsia="Times New Roman" w:cs="Times New Roman"/>
-                <w:sz w:val="24"/>
-                <w:szCs w:val="24"/>
-              </w:rPr>
-            </w:pPr>
-            <w:r>
-              <w:rPr>
-                <w:rFonts w:ascii="Segoe UI Emoji" w:hAnsi="Segoe UI Emoji" w:cs="Segoe UI Emoji"/>
-                <w:sz w:val="24"/>
-                <w:szCs w:val="24"/>
-              </w:rPr>
-              <w:t>= s</w:t>
-            </w:r>
-            <w:r>
-              <w:rPr>
-                <w:rFonts w:ascii="Calibri" w:hAnsi="Calibri" w:cs="Calibri"/>
-                <w:sz w:val="24"/>
-                <w:szCs w:val="24"/>
-              </w:rPr>
-              <w:t>ố ngày check in trong 30 ngày gần nhất, tính từ ngày today-1</w:t>
-            </w:r>
+        <w:tc>
+          <w:tcPr>
+            <w:tcW w:w="3440" w:type="dxa"/>
+            <w:gridSpan w:val="2"/>
+            <w:vAlign w:val="center"/>
+          </w:tcPr>
+          <w:p>
+            <w:pPr>
+              <w:spacing w:before="100" w:beforeAutospacing="1" w:after="100" w:afterAutospacing="1" w:line="240" w:lineRule="auto"/>
+              <w:jc w:val="left"/>
+              <w:outlineLvl w:val="2"/>
+              <w:rPr>
+                <w:rFonts w:eastAsia="Times New Roman" w:cs="Times New Roman"/>
+                <w:sz w:val="24"/>
+                <w:szCs w:val="24"/>
+              </w:rPr>
+            </w:pPr>
+          </w:p>
+        </w:tc>
+        <w:tc>
+          <w:tcPr>
+            <w:tcW w:w="3111" w:type="dxa"/>
+            <w:vAlign w:val="center"/>
+          </w:tcPr>
+          <w:p>
+            <w:pPr>
+              <w:spacing w:before="100" w:beforeAutospacing="1" w:after="100" w:afterAutospacing="1" w:line="240" w:lineRule="auto"/>
+              <w:jc w:val="left"/>
+              <w:outlineLvl w:val="2"/>
+              <w:rPr>
+                <w:rFonts w:eastAsia="Times New Roman" w:cs="Times New Roman"/>
+                <w:b/>
+                <w:bCs/>
+                <w:sz w:val="24"/>
+                <w:szCs w:val="24"/>
+              </w:rPr>
+            </w:pPr>
+            <w:r>
+              <w:rPr>
+                <w:rFonts w:eastAsia="Times New Roman" w:cs="Times New Roman"/>
+                <w:sz w:val="24"/>
+                <w:szCs w:val="24"/>
+              </w:rPr>
+              <w:t>Lo lắng</w:t>
+            </w:r>
+          </w:p>
+        </w:tc>
+        <w:tc>
+          <w:tcPr>
+            <w:tcW w:w="2843" w:type="dxa"/>
+          </w:tcPr>
+          <w:p>
+            <w:pPr>
+              <w:spacing w:before="100" w:beforeAutospacing="1" w:after="100" w:afterAutospacing="1" w:line="240" w:lineRule="auto"/>
+              <w:jc w:val="left"/>
+              <w:outlineLvl w:val="2"/>
+              <w:rPr>
+                <w:rFonts w:eastAsia="Times New Roman" w:cs="Times New Roman"/>
+                <w:sz w:val="24"/>
+                <w:szCs w:val="24"/>
+              </w:rPr>
+            </w:pPr>
           </w:p>
         </w:tc>
       </w:tr>
       <w:tr>
-        <w:trPr>
-          <w:trHeight w:val="235"/>
-          <w:tblCellSpacing w:w="15" w:type="dxa"/>
-        </w:trPr>
-        <w:tc>
-          <w:tcPr>
-            <w:tcW w:w="1675" w:type="dxa"/>
-            <w:vAlign w:val="center"/>
-            <w:hideMark/>
-          </w:tcPr>
-          <w:p>
-            <w:pPr>
-              <w:spacing w:after="0" w:line="240" w:lineRule="auto"/>
-              <w:jc w:val="left"/>
-              <w:rPr>
-                <w:rFonts w:eastAsia="Times New Roman" w:cs="Times New Roman"/>
-                <w:sz w:val="24"/>
-                <w:szCs w:val="24"/>
-              </w:rPr>
-            </w:pPr>
-            <w:r>
-              <w:rPr>
-                <w:rFonts w:eastAsia="Times New Roman" w:cs="Times New Roman"/>
-                <w:sz w:val="24"/>
-                <w:szCs w:val="24"/>
-              </w:rPr>
-              <w:t>Đau bụng</w:t>
-            </w:r>
-          </w:p>
-        </w:tc>
-        <w:tc>
-          <w:tcPr>
-            <w:tcW w:w="7586" w:type="dxa"/>
-          </w:tcPr>
-          <w:p>
-            <w:pPr>
-              <w:spacing w:after="0" w:line="240" w:lineRule="auto"/>
-              <w:jc w:val="left"/>
-              <w:rPr>
-                <w:rFonts w:eastAsia="Times New Roman" w:cs="Times New Roman"/>
-                <w:sz w:val="24"/>
-                <w:szCs w:val="24"/>
-              </w:rPr>
-            </w:pPr>
-            <w:r>
-              <w:rPr>
-                <w:rFonts w:ascii="Segoe UI Emoji" w:hAnsi="Segoe UI Emoji" w:cs="Segoe UI Emoji"/>
-                <w:sz w:val="24"/>
-                <w:szCs w:val="24"/>
-              </w:rPr>
-              <w:t>= s</w:t>
-            </w:r>
-            <w:r>
-              <w:rPr>
-                <w:rFonts w:ascii="Calibri" w:hAnsi="Calibri" w:cs="Calibri"/>
-                <w:sz w:val="24"/>
-                <w:szCs w:val="24"/>
-              </w:rPr>
-              <w:t>ố ngày check in trong 30 ngày gần nhất, tính từ ngày today-1</w:t>
-            </w:r>
+        <w:tc>
+          <w:tcPr>
+            <w:tcW w:w="3440" w:type="dxa"/>
+            <w:gridSpan w:val="2"/>
+            <w:vAlign w:val="center"/>
+          </w:tcPr>
+          <w:p>
+            <w:pPr>
+              <w:spacing w:before="100" w:beforeAutospacing="1" w:after="100" w:afterAutospacing="1" w:line="240" w:lineRule="auto"/>
+              <w:jc w:val="left"/>
+              <w:outlineLvl w:val="2"/>
+              <w:rPr>
+                <w:rFonts w:eastAsia="Times New Roman" w:cs="Times New Roman"/>
+                <w:sz w:val="24"/>
+                <w:szCs w:val="24"/>
+              </w:rPr>
+            </w:pPr>
+          </w:p>
+        </w:tc>
+        <w:tc>
+          <w:tcPr>
+            <w:tcW w:w="3111" w:type="dxa"/>
+            <w:vAlign w:val="center"/>
+          </w:tcPr>
+          <w:p>
+            <w:pPr>
+              <w:spacing w:before="100" w:beforeAutospacing="1" w:after="100" w:afterAutospacing="1" w:line="240" w:lineRule="auto"/>
+              <w:jc w:val="left"/>
+              <w:outlineLvl w:val="2"/>
+              <w:rPr>
+                <w:rFonts w:eastAsia="Times New Roman" w:cs="Times New Roman"/>
+                <w:b/>
+                <w:bCs/>
+                <w:sz w:val="24"/>
+                <w:szCs w:val="24"/>
+              </w:rPr>
+            </w:pPr>
+            <w:r>
+              <w:rPr>
+                <w:rFonts w:eastAsia="Times New Roman" w:cs="Times New Roman"/>
+                <w:sz w:val="24"/>
+                <w:szCs w:val="24"/>
+              </w:rPr>
+              <w:t>Uể oải</w:t>
+            </w:r>
+          </w:p>
+        </w:tc>
+        <w:tc>
+          <w:tcPr>
+            <w:tcW w:w="2843" w:type="dxa"/>
+          </w:tcPr>
+          <w:p>
+            <w:pPr>
+              <w:spacing w:before="100" w:beforeAutospacing="1" w:after="100" w:afterAutospacing="1" w:line="240" w:lineRule="auto"/>
+              <w:jc w:val="left"/>
+              <w:outlineLvl w:val="2"/>
+              <w:rPr>
+                <w:rFonts w:eastAsia="Times New Roman" w:cs="Times New Roman"/>
+                <w:sz w:val="24"/>
+                <w:szCs w:val="24"/>
+              </w:rPr>
+            </w:pPr>
           </w:p>
         </w:tc>
       </w:tr>
       <w:tr>
-        <w:trPr>
-          <w:trHeight w:val="223"/>
-          <w:tblCellSpacing w:w="15" w:type="dxa"/>
-        </w:trPr>
-        <w:tc>
-          <w:tcPr>
-            <w:tcW w:w="1675" w:type="dxa"/>
-            <w:vAlign w:val="center"/>
-          </w:tcPr>
-          <w:p>
-            <w:pPr>
-              <w:spacing w:after="0" w:line="240" w:lineRule="auto"/>
-              <w:jc w:val="left"/>
-              <w:rPr>
-                <w:rFonts w:eastAsia="Times New Roman" w:cs="Times New Roman"/>
-                <w:sz w:val="24"/>
-                <w:szCs w:val="24"/>
-              </w:rPr>
-            </w:pPr>
-            <w:r>
-              <w:rPr>
-                <w:rFonts w:eastAsia="Times New Roman" w:cs="Times New Roman"/>
-                <w:sz w:val="24"/>
-                <w:szCs w:val="24"/>
-              </w:rPr>
-              <w:t>Đau lưng</w:t>
-            </w:r>
-          </w:p>
-        </w:tc>
-        <w:tc>
-          <w:tcPr>
-            <w:tcW w:w="7586" w:type="dxa"/>
-          </w:tcPr>
-          <w:p>
-            <w:pPr>
-              <w:spacing w:after="0" w:line="240" w:lineRule="auto"/>
-              <w:jc w:val="left"/>
-              <w:rPr>
-                <w:rFonts w:ascii="Segoe UI Emoji" w:hAnsi="Segoe UI Emoji" w:cs="Segoe UI Emoji"/>
-                <w:sz w:val="24"/>
-                <w:szCs w:val="24"/>
-              </w:rPr>
-            </w:pPr>
-            <w:r>
-              <w:rPr>
-                <w:rFonts w:ascii="Segoe UI Emoji" w:hAnsi="Segoe UI Emoji" w:cs="Segoe UI Emoji"/>
-                <w:sz w:val="24"/>
-                <w:szCs w:val="24"/>
-              </w:rPr>
-              <w:t>= s</w:t>
-            </w:r>
-            <w:r>
-              <w:rPr>
-                <w:rFonts w:ascii="Calibri" w:hAnsi="Calibri" w:cs="Calibri"/>
-                <w:sz w:val="24"/>
-                <w:szCs w:val="24"/>
-              </w:rPr>
-              <w:t>ố ngày check in trong 30 ngày gần nhất, tính từ ngày today-1</w:t>
-            </w:r>
+        <w:tc>
+          <w:tcPr>
+            <w:tcW w:w="3440" w:type="dxa"/>
+            <w:gridSpan w:val="2"/>
+            <w:vAlign w:val="center"/>
+          </w:tcPr>
+          <w:p>
+            <w:pPr>
+              <w:spacing w:before="100" w:beforeAutospacing="1" w:after="100" w:afterAutospacing="1" w:line="240" w:lineRule="auto"/>
+              <w:jc w:val="left"/>
+              <w:outlineLvl w:val="2"/>
+              <w:rPr>
+                <w:rFonts w:eastAsia="Times New Roman" w:cs="Times New Roman"/>
+                <w:sz w:val="24"/>
+                <w:szCs w:val="24"/>
+              </w:rPr>
+            </w:pPr>
+          </w:p>
+        </w:tc>
+        <w:tc>
+          <w:tcPr>
+            <w:tcW w:w="3111" w:type="dxa"/>
+          </w:tcPr>
+          <w:p>
+            <w:pPr>
+              <w:spacing w:before="100" w:beforeAutospacing="1" w:after="100" w:afterAutospacing="1" w:line="240" w:lineRule="auto"/>
+              <w:jc w:val="left"/>
+              <w:outlineLvl w:val="2"/>
+              <w:rPr>
+                <w:rFonts w:eastAsia="Times New Roman" w:cs="Times New Roman"/>
+                <w:b/>
+                <w:bCs/>
+                <w:sz w:val="24"/>
+                <w:szCs w:val="24"/>
+              </w:rPr>
+            </w:pPr>
+            <w:r>
+              <w:rPr>
+                <w:rFonts w:eastAsia="Times New Roman" w:cs="Times New Roman"/>
+                <w:sz w:val="24"/>
+                <w:szCs w:val="24"/>
+              </w:rPr>
+              <w:t>Đang trong kỳ</w:t>
+            </w:r>
+          </w:p>
+        </w:tc>
+        <w:tc>
+          <w:tcPr>
+            <w:tcW w:w="2843" w:type="dxa"/>
+          </w:tcPr>
+          <w:p>
+            <w:pPr>
+              <w:spacing w:before="100" w:beforeAutospacing="1" w:after="100" w:afterAutospacing="1" w:line="240" w:lineRule="auto"/>
+              <w:jc w:val="left"/>
+              <w:outlineLvl w:val="2"/>
+              <w:rPr>
+                <w:rFonts w:eastAsia="Times New Roman" w:cs="Times New Roman"/>
+                <w:sz w:val="24"/>
+                <w:szCs w:val="24"/>
+              </w:rPr>
+            </w:pPr>
           </w:p>
         </w:tc>
       </w:tr>
       <w:tr>
-        <w:trPr>
-          <w:trHeight w:val="235"/>
-          <w:tblCellSpacing w:w="15" w:type="dxa"/>
-        </w:trPr>
-        <w:tc>
-          <w:tcPr>
-            <w:tcW w:w="1675" w:type="dxa"/>
-            <w:vAlign w:val="center"/>
-            <w:hideMark/>
-          </w:tcPr>
-          <w:p>
-            <w:pPr>
-              <w:spacing w:after="0" w:line="240" w:lineRule="auto"/>
-              <w:jc w:val="left"/>
-              <w:rPr>
-                <w:rFonts w:eastAsia="Times New Roman" w:cs="Times New Roman"/>
-                <w:sz w:val="24"/>
-                <w:szCs w:val="24"/>
-              </w:rPr>
-            </w:pPr>
-            <w:r>
-              <w:rPr>
-                <w:rFonts w:eastAsia="Times New Roman" w:cs="Times New Roman"/>
-                <w:sz w:val="24"/>
-                <w:szCs w:val="24"/>
-              </w:rPr>
-              <w:t>Buồn nôn</w:t>
-            </w:r>
-          </w:p>
-        </w:tc>
-        <w:tc>
-          <w:tcPr>
-            <w:tcW w:w="7586" w:type="dxa"/>
-          </w:tcPr>
-          <w:p>
-            <w:pPr>
-              <w:spacing w:after="0" w:line="240" w:lineRule="auto"/>
-              <w:jc w:val="left"/>
-              <w:rPr>
-                <w:rFonts w:eastAsia="Times New Roman" w:cs="Times New Roman"/>
-                <w:sz w:val="24"/>
-                <w:szCs w:val="24"/>
-              </w:rPr>
-            </w:pPr>
-            <w:r>
-              <w:rPr>
-                <w:rFonts w:ascii="Segoe UI Emoji" w:hAnsi="Segoe UI Emoji" w:cs="Segoe UI Emoji"/>
-                <w:sz w:val="24"/>
-                <w:szCs w:val="24"/>
-              </w:rPr>
-              <w:t>= s</w:t>
-            </w:r>
-            <w:r>
-              <w:rPr>
-                <w:rFonts w:ascii="Calibri" w:hAnsi="Calibri" w:cs="Calibri"/>
-                <w:sz w:val="24"/>
-                <w:szCs w:val="24"/>
-              </w:rPr>
-              <w:t>ố ngày check in trong 30 ngày gần nhất, tính từ ngày today-1</w:t>
-            </w:r>
+        <w:tc>
+          <w:tcPr>
+            <w:tcW w:w="3440" w:type="dxa"/>
+            <w:gridSpan w:val="2"/>
+            <w:vAlign w:val="center"/>
+          </w:tcPr>
+          <w:p>
+            <w:pPr>
+              <w:spacing w:before="100" w:beforeAutospacing="1" w:after="100" w:afterAutospacing="1" w:line="240" w:lineRule="auto"/>
+              <w:jc w:val="left"/>
+              <w:outlineLvl w:val="2"/>
+              <w:rPr>
+                <w:rFonts w:eastAsia="Times New Roman" w:cs="Times New Roman"/>
+                <w:sz w:val="24"/>
+                <w:szCs w:val="24"/>
+              </w:rPr>
+            </w:pPr>
+          </w:p>
+        </w:tc>
+        <w:tc>
+          <w:tcPr>
+            <w:tcW w:w="3111" w:type="dxa"/>
+          </w:tcPr>
+          <w:p>
+            <w:pPr>
+              <w:spacing w:before="100" w:beforeAutospacing="1" w:after="100" w:afterAutospacing="1" w:line="240" w:lineRule="auto"/>
+              <w:jc w:val="left"/>
+              <w:outlineLvl w:val="2"/>
+              <w:rPr>
+                <w:rFonts w:eastAsia="Times New Roman" w:cs="Times New Roman"/>
+                <w:b/>
+                <w:bCs/>
+                <w:sz w:val="24"/>
+                <w:szCs w:val="24"/>
+              </w:rPr>
+            </w:pPr>
+            <w:r>
+              <w:rPr>
+                <w:rFonts w:eastAsia="Times New Roman" w:cs="Times New Roman"/>
+                <w:sz w:val="24"/>
+                <w:szCs w:val="24"/>
+              </w:rPr>
+              <w:t>Khí hư</w:t>
+            </w:r>
+          </w:p>
+        </w:tc>
+        <w:tc>
+          <w:tcPr>
+            <w:tcW w:w="2843" w:type="dxa"/>
+          </w:tcPr>
+          <w:p>
+            <w:pPr>
+              <w:spacing w:before="100" w:beforeAutospacing="1" w:after="100" w:afterAutospacing="1" w:line="240" w:lineRule="auto"/>
+              <w:jc w:val="left"/>
+              <w:outlineLvl w:val="2"/>
+              <w:rPr>
+                <w:rFonts w:eastAsia="Times New Roman" w:cs="Times New Roman"/>
+                <w:sz w:val="24"/>
+                <w:szCs w:val="24"/>
+              </w:rPr>
+            </w:pPr>
           </w:p>
         </w:tc>
       </w:tr>
       <w:tr>
-        <w:trPr>
-          <w:trHeight w:val="235"/>
-          <w:tblCellSpacing w:w="15" w:type="dxa"/>
-        </w:trPr>
-        <w:tc>
-          <w:tcPr>
-            <w:tcW w:w="1675" w:type="dxa"/>
-            <w:vAlign w:val="center"/>
-            <w:hideMark/>
-          </w:tcPr>
-          <w:p>
-            <w:pPr>
-              <w:spacing w:after="0" w:line="240" w:lineRule="auto"/>
-              <w:jc w:val="left"/>
-              <w:rPr>
-                <w:rFonts w:eastAsia="Times New Roman" w:cs="Times New Roman"/>
-                <w:sz w:val="24"/>
-                <w:szCs w:val="24"/>
-              </w:rPr>
-            </w:pPr>
-            <w:r>
-              <w:rPr>
-                <w:rFonts w:eastAsia="Times New Roman" w:cs="Times New Roman"/>
-                <w:sz w:val="24"/>
-                <w:szCs w:val="24"/>
-              </w:rPr>
-              <w:t>Chóng mặt</w:t>
-            </w:r>
-          </w:p>
-        </w:tc>
-        <w:tc>
-          <w:tcPr>
-            <w:tcW w:w="7586" w:type="dxa"/>
-          </w:tcPr>
-          <w:p>
-            <w:pPr>
-              <w:spacing w:after="0" w:line="240" w:lineRule="auto"/>
-              <w:jc w:val="left"/>
-              <w:rPr>
-                <w:rFonts w:eastAsia="Times New Roman" w:cs="Times New Roman"/>
-                <w:sz w:val="24"/>
-                <w:szCs w:val="24"/>
-              </w:rPr>
-            </w:pPr>
-            <w:r>
-              <w:rPr>
-                <w:rFonts w:ascii="Segoe UI Emoji" w:hAnsi="Segoe UI Emoji" w:cs="Segoe UI Emoji"/>
-                <w:sz w:val="24"/>
-                <w:szCs w:val="24"/>
-              </w:rPr>
-              <w:t>= s</w:t>
-            </w:r>
-            <w:r>
-              <w:rPr>
-                <w:rFonts w:ascii="Calibri" w:hAnsi="Calibri" w:cs="Calibri"/>
-                <w:sz w:val="24"/>
-                <w:szCs w:val="24"/>
-              </w:rPr>
-              <w:t>ố ngày check in trong 30 ngày gần nhất, tính từ ngày today-1</w:t>
-            </w:r>
+        <w:tc>
+          <w:tcPr>
+            <w:tcW w:w="3440" w:type="dxa"/>
+            <w:gridSpan w:val="2"/>
+            <w:vAlign w:val="center"/>
+          </w:tcPr>
+          <w:p>
+            <w:pPr>
+              <w:spacing w:before="100" w:beforeAutospacing="1" w:after="100" w:afterAutospacing="1" w:line="240" w:lineRule="auto"/>
+              <w:jc w:val="left"/>
+              <w:outlineLvl w:val="2"/>
+              <w:rPr>
+                <w:rFonts w:eastAsia="Times New Roman" w:cs="Times New Roman"/>
+                <w:sz w:val="24"/>
+                <w:szCs w:val="24"/>
+              </w:rPr>
+            </w:pPr>
+          </w:p>
+        </w:tc>
+        <w:tc>
+          <w:tcPr>
+            <w:tcW w:w="3111" w:type="dxa"/>
+          </w:tcPr>
+          <w:p>
+            <w:pPr>
+              <w:spacing w:before="100" w:beforeAutospacing="1" w:after="100" w:afterAutospacing="1" w:line="240" w:lineRule="auto"/>
+              <w:jc w:val="left"/>
+              <w:outlineLvl w:val="2"/>
+              <w:rPr>
+                <w:rFonts w:eastAsia="Times New Roman" w:cs="Times New Roman"/>
+                <w:b/>
+                <w:bCs/>
+                <w:sz w:val="24"/>
+                <w:szCs w:val="24"/>
+              </w:rPr>
+            </w:pPr>
+            <w:r>
+              <w:rPr>
+                <w:rFonts w:eastAsia="Times New Roman" w:cs="Times New Roman"/>
+                <w:sz w:val="24"/>
+                <w:szCs w:val="24"/>
+              </w:rPr>
+              <w:t>Không trong kỳ</w:t>
+            </w:r>
+          </w:p>
+        </w:tc>
+        <w:tc>
+          <w:tcPr>
+            <w:tcW w:w="2843" w:type="dxa"/>
+          </w:tcPr>
+          <w:p>
+            <w:pPr>
+              <w:spacing w:before="100" w:beforeAutospacing="1" w:after="100" w:afterAutospacing="1" w:line="240" w:lineRule="auto"/>
+              <w:jc w:val="left"/>
+              <w:outlineLvl w:val="2"/>
+              <w:rPr>
+                <w:rFonts w:eastAsia="Times New Roman" w:cs="Times New Roman"/>
+                <w:sz w:val="24"/>
+                <w:szCs w:val="24"/>
+              </w:rPr>
+            </w:pPr>
           </w:p>
         </w:tc>
       </w:tr>
       <w:tr>
-        <w:trPr>
-          <w:trHeight w:val="223"/>
-          <w:tblCellSpacing w:w="15" w:type="dxa"/>
-        </w:trPr>
-        <w:tc>
-          <w:tcPr>
-            <w:tcW w:w="1675" w:type="dxa"/>
-            <w:vAlign w:val="center"/>
-            <w:hideMark/>
-          </w:tcPr>
-          <w:p>
-            <w:pPr>
-              <w:spacing w:after="0" w:line="240" w:lineRule="auto"/>
-              <w:jc w:val="left"/>
-              <w:rPr>
-                <w:rFonts w:eastAsia="Times New Roman" w:cs="Times New Roman"/>
-                <w:sz w:val="24"/>
-                <w:szCs w:val="24"/>
-              </w:rPr>
-            </w:pPr>
-            <w:r>
-              <w:rPr>
-                <w:rFonts w:eastAsia="Times New Roman" w:cs="Times New Roman"/>
-                <w:sz w:val="24"/>
-                <w:szCs w:val="24"/>
-              </w:rPr>
-              <w:t>Nổi mụn</w:t>
-            </w:r>
-          </w:p>
-        </w:tc>
-        <w:tc>
-          <w:tcPr>
-            <w:tcW w:w="7586" w:type="dxa"/>
-          </w:tcPr>
-          <w:p>
-            <w:pPr>
-              <w:spacing w:after="0" w:line="240" w:lineRule="auto"/>
-              <w:jc w:val="left"/>
-              <w:rPr>
-                <w:rFonts w:eastAsia="Times New Roman" w:cs="Times New Roman"/>
-                <w:sz w:val="24"/>
-                <w:szCs w:val="24"/>
-              </w:rPr>
-            </w:pPr>
-            <w:r>
-              <w:rPr>
-                <w:rFonts w:ascii="Segoe UI Emoji" w:hAnsi="Segoe UI Emoji" w:cs="Segoe UI Emoji"/>
-                <w:sz w:val="24"/>
-                <w:szCs w:val="24"/>
-              </w:rPr>
-              <w:t>= s</w:t>
-            </w:r>
-            <w:r>
-              <w:rPr>
-                <w:rFonts w:ascii="Calibri" w:hAnsi="Calibri" w:cs="Calibri"/>
-                <w:sz w:val="24"/>
-                <w:szCs w:val="24"/>
-              </w:rPr>
-              <w:t>ố ngày check in trong 30 ngày gần nhất, tính từ ngày today-1</w:t>
-            </w:r>
+        <w:tc>
+          <w:tcPr>
+            <w:tcW w:w="3440" w:type="dxa"/>
+            <w:gridSpan w:val="2"/>
+            <w:vAlign w:val="center"/>
+          </w:tcPr>
+          <w:p>
+            <w:pPr>
+              <w:spacing w:before="100" w:beforeAutospacing="1" w:after="100" w:afterAutospacing="1" w:line="240" w:lineRule="auto"/>
+              <w:jc w:val="left"/>
+              <w:outlineLvl w:val="2"/>
+              <w:rPr>
+                <w:rFonts w:eastAsia="Times New Roman" w:cs="Times New Roman"/>
+                <w:sz w:val="24"/>
+                <w:szCs w:val="24"/>
+              </w:rPr>
+            </w:pPr>
+          </w:p>
+        </w:tc>
+        <w:tc>
+          <w:tcPr>
+            <w:tcW w:w="3111" w:type="dxa"/>
+          </w:tcPr>
+          <w:p>
+            <w:pPr>
+              <w:spacing w:before="100" w:beforeAutospacing="1" w:after="100" w:afterAutospacing="1" w:line="240" w:lineRule="auto"/>
+              <w:jc w:val="left"/>
+              <w:outlineLvl w:val="2"/>
+              <w:rPr>
+                <w:rFonts w:eastAsia="Times New Roman" w:cs="Times New Roman"/>
+                <w:b/>
+                <w:bCs/>
+                <w:sz w:val="24"/>
+                <w:szCs w:val="24"/>
+              </w:rPr>
+            </w:pPr>
+            <w:r>
+              <w:rPr>
+                <w:rFonts w:eastAsia="Times New Roman" w:cs="Times New Roman"/>
+                <w:sz w:val="24"/>
+                <w:szCs w:val="24"/>
+              </w:rPr>
+              <w:t>Đang trong kỳ</w:t>
+            </w:r>
+          </w:p>
+        </w:tc>
+        <w:tc>
+          <w:tcPr>
+            <w:tcW w:w="2843" w:type="dxa"/>
+          </w:tcPr>
+          <w:p>
+            <w:pPr>
+              <w:spacing w:before="100" w:beforeAutospacing="1" w:after="100" w:afterAutospacing="1" w:line="240" w:lineRule="auto"/>
+              <w:jc w:val="left"/>
+              <w:outlineLvl w:val="2"/>
+              <w:rPr>
+                <w:rFonts w:eastAsia="Times New Roman" w:cs="Times New Roman"/>
+                <w:sz w:val="24"/>
+                <w:szCs w:val="24"/>
+              </w:rPr>
+            </w:pPr>
           </w:p>
         </w:tc>
       </w:tr>
       <w:tr>
-        <w:trPr>
-          <w:trHeight w:val="235"/>
-          <w:tblCellSpacing w:w="15" w:type="dxa"/>
-        </w:trPr>
-        <w:tc>
-          <w:tcPr>
-            <w:tcW w:w="1675" w:type="dxa"/>
-            <w:vAlign w:val="center"/>
-            <w:hideMark/>
-          </w:tcPr>
-          <w:p>
-            <w:pPr>
-              <w:spacing w:after="0" w:line="240" w:lineRule="auto"/>
-              <w:jc w:val="left"/>
-              <w:rPr>
-                <w:rFonts w:eastAsia="Times New Roman" w:cs="Times New Roman"/>
-                <w:sz w:val="24"/>
-                <w:szCs w:val="24"/>
-              </w:rPr>
-            </w:pPr>
-            <w:r>
-              <w:rPr>
-                <w:rFonts w:eastAsia="Times New Roman" w:cs="Times New Roman"/>
-                <w:sz w:val="24"/>
-                <w:szCs w:val="24"/>
-              </w:rPr>
-              <w:t>Khó chịu</w:t>
-            </w:r>
-          </w:p>
-        </w:tc>
-        <w:tc>
-          <w:tcPr>
-            <w:tcW w:w="7586" w:type="dxa"/>
-          </w:tcPr>
-          <w:p>
-            <w:pPr>
-              <w:spacing w:after="0" w:line="240" w:lineRule="auto"/>
-              <w:jc w:val="left"/>
-              <w:rPr>
-                <w:rFonts w:eastAsia="Times New Roman" w:cs="Times New Roman"/>
-                <w:sz w:val="24"/>
-                <w:szCs w:val="24"/>
-              </w:rPr>
-            </w:pPr>
-            <w:r>
-              <w:rPr>
-                <w:rFonts w:ascii="Segoe UI Emoji" w:hAnsi="Segoe UI Emoji" w:cs="Segoe UI Emoji"/>
-                <w:sz w:val="24"/>
-                <w:szCs w:val="24"/>
-              </w:rPr>
-              <w:t>= s</w:t>
-            </w:r>
-            <w:r>
-              <w:rPr>
-                <w:rFonts w:ascii="Calibri" w:hAnsi="Calibri" w:cs="Calibri"/>
-                <w:sz w:val="24"/>
-                <w:szCs w:val="24"/>
-              </w:rPr>
-              <w:t>ố ngày check in trong 30 ngày gần nhất, tính từ ngày today-1</w:t>
-            </w:r>
+        <w:tc>
+          <w:tcPr>
+            <w:tcW w:w="3440" w:type="dxa"/>
+            <w:gridSpan w:val="2"/>
+            <w:vAlign w:val="center"/>
+          </w:tcPr>
+          <w:p>
+            <w:pPr>
+              <w:spacing w:before="100" w:beforeAutospacing="1" w:after="100" w:afterAutospacing="1" w:line="240" w:lineRule="auto"/>
+              <w:jc w:val="left"/>
+              <w:outlineLvl w:val="2"/>
+              <w:rPr>
+                <w:rFonts w:eastAsia="Times New Roman" w:cs="Times New Roman"/>
+                <w:sz w:val="24"/>
+                <w:szCs w:val="24"/>
+              </w:rPr>
+            </w:pPr>
+          </w:p>
+        </w:tc>
+        <w:tc>
+          <w:tcPr>
+            <w:tcW w:w="3111" w:type="dxa"/>
+          </w:tcPr>
+          <w:p>
+            <w:pPr>
+              <w:spacing w:before="100" w:beforeAutospacing="1" w:after="100" w:afterAutospacing="1" w:line="240" w:lineRule="auto"/>
+              <w:jc w:val="left"/>
+              <w:outlineLvl w:val="2"/>
+              <w:rPr>
+                <w:rFonts w:eastAsia="Times New Roman" w:cs="Times New Roman"/>
+                <w:b/>
+                <w:bCs/>
+                <w:sz w:val="24"/>
+                <w:szCs w:val="24"/>
+              </w:rPr>
+            </w:pPr>
+            <w:r>
+              <w:rPr>
+                <w:rFonts w:eastAsia="Times New Roman" w:cs="Times New Roman"/>
+                <w:sz w:val="24"/>
+                <w:szCs w:val="24"/>
+              </w:rPr>
+              <w:t>Mộng tinh</w:t>
+            </w:r>
+          </w:p>
+        </w:tc>
+        <w:tc>
+          <w:tcPr>
+            <w:tcW w:w="2843" w:type="dxa"/>
+          </w:tcPr>
+          <w:p>
+            <w:pPr>
+              <w:spacing w:before="100" w:beforeAutospacing="1" w:after="100" w:afterAutospacing="1" w:line="240" w:lineRule="auto"/>
+              <w:jc w:val="left"/>
+              <w:outlineLvl w:val="2"/>
+              <w:rPr>
+                <w:rFonts w:eastAsia="Times New Roman" w:cs="Times New Roman"/>
+                <w:sz w:val="24"/>
+                <w:szCs w:val="24"/>
+              </w:rPr>
+            </w:pPr>
           </w:p>
         </w:tc>
       </w:tr>
       <w:tr>
-        <w:trPr>
-          <w:trHeight w:val="235"/>
-          <w:tblCellSpacing w:w="15" w:type="dxa"/>
-        </w:trPr>
-        <w:tc>
-          <w:tcPr>
-            <w:tcW w:w="1675" w:type="dxa"/>
-            <w:vAlign w:val="center"/>
-          </w:tcPr>
-          <w:p>
-            <w:pPr>
-              <w:spacing w:after="0" w:line="240" w:lineRule="auto"/>
-              <w:jc w:val="left"/>
+        <w:tc>
+          <w:tcPr>
+            <w:tcW w:w="3440" w:type="dxa"/>
+            <w:gridSpan w:val="2"/>
+            <w:vAlign w:val="center"/>
+          </w:tcPr>
+          <w:p>
+            <w:pPr>
+              <w:spacing w:before="100" w:beforeAutospacing="1" w:after="100" w:afterAutospacing="1" w:line="240" w:lineRule="auto"/>
+              <w:jc w:val="left"/>
+              <w:outlineLvl w:val="2"/>
+              <w:rPr>
+                <w:rFonts w:eastAsia="Times New Roman" w:cs="Times New Roman"/>
+                <w:sz w:val="24"/>
+                <w:szCs w:val="24"/>
+              </w:rPr>
+            </w:pPr>
+          </w:p>
+        </w:tc>
+        <w:tc>
+          <w:tcPr>
+            <w:tcW w:w="3111" w:type="dxa"/>
+          </w:tcPr>
+          <w:p>
+            <w:pPr>
+              <w:spacing w:before="100" w:beforeAutospacing="1" w:after="100" w:afterAutospacing="1" w:line="240" w:lineRule="auto"/>
+              <w:jc w:val="left"/>
+              <w:outlineLvl w:val="2"/>
+              <w:rPr>
+                <w:rFonts w:eastAsia="Times New Roman" w:cs="Times New Roman"/>
+                <w:b/>
+                <w:bCs/>
+                <w:sz w:val="24"/>
+                <w:szCs w:val="24"/>
+              </w:rPr>
+            </w:pPr>
+            <w:r>
+              <w:rPr>
+                <w:rFonts w:eastAsia="Times New Roman" w:cs="Times New Roman"/>
+                <w:sz w:val="24"/>
+                <w:szCs w:val="24"/>
+              </w:rPr>
+              <w:t>Căng tức</w:t>
+            </w:r>
+          </w:p>
+        </w:tc>
+        <w:tc>
+          <w:tcPr>
+            <w:tcW w:w="2843" w:type="dxa"/>
+          </w:tcPr>
+          <w:p>
+            <w:pPr>
+              <w:spacing w:before="100" w:beforeAutospacing="1" w:after="100" w:afterAutospacing="1" w:line="240" w:lineRule="auto"/>
+              <w:jc w:val="left"/>
+              <w:outlineLvl w:val="2"/>
+              <w:rPr>
+                <w:rFonts w:eastAsia="Times New Roman" w:cs="Times New Roman"/>
+                <w:sz w:val="24"/>
+                <w:szCs w:val="24"/>
+              </w:rPr>
+            </w:pPr>
+          </w:p>
+        </w:tc>
+      </w:tr>
+      <w:tr>
+        <w:tc>
+          <w:tcPr>
+            <w:tcW w:w="3440" w:type="dxa"/>
+            <w:gridSpan w:val="2"/>
+            <w:vAlign w:val="center"/>
+          </w:tcPr>
+          <w:p>
+            <w:pPr>
+              <w:spacing w:before="100" w:beforeAutospacing="1" w:after="100" w:afterAutospacing="1" w:line="240" w:lineRule="auto"/>
+              <w:jc w:val="left"/>
+              <w:outlineLvl w:val="2"/>
+              <w:rPr>
+                <w:rFonts w:eastAsia="Times New Roman" w:cs="Times New Roman"/>
+                <w:sz w:val="24"/>
+                <w:szCs w:val="24"/>
+              </w:rPr>
+            </w:pPr>
+          </w:p>
+        </w:tc>
+        <w:tc>
+          <w:tcPr>
+            <w:tcW w:w="3111" w:type="dxa"/>
+          </w:tcPr>
+          <w:p>
+            <w:pPr>
+              <w:spacing w:before="100" w:beforeAutospacing="1" w:after="100" w:afterAutospacing="1" w:line="240" w:lineRule="auto"/>
+              <w:jc w:val="left"/>
+              <w:outlineLvl w:val="2"/>
+              <w:rPr>
+                <w:rFonts w:eastAsia="Times New Roman" w:cs="Times New Roman"/>
+                <w:b/>
+                <w:bCs/>
+                <w:sz w:val="24"/>
+                <w:szCs w:val="24"/>
+              </w:rPr>
+            </w:pPr>
+            <w:r>
+              <w:rPr>
+                <w:rFonts w:eastAsia="Times New Roman" w:cs="Times New Roman"/>
+                <w:sz w:val="24"/>
+                <w:szCs w:val="24"/>
+              </w:rPr>
+              <w:t>Không có gì</w:t>
+            </w:r>
+          </w:p>
+        </w:tc>
+        <w:tc>
+          <w:tcPr>
+            <w:tcW w:w="2843" w:type="dxa"/>
+          </w:tcPr>
+          <w:p>
+            <w:pPr>
+              <w:spacing w:before="100" w:beforeAutospacing="1" w:after="100" w:afterAutospacing="1" w:line="240" w:lineRule="auto"/>
+              <w:jc w:val="left"/>
+              <w:outlineLvl w:val="2"/>
+              <w:rPr>
+                <w:rFonts w:eastAsia="Times New Roman" w:cs="Times New Roman"/>
+                <w:sz w:val="24"/>
+                <w:szCs w:val="24"/>
+              </w:rPr>
+            </w:pPr>
+          </w:p>
+        </w:tc>
+      </w:tr>
+      <w:tr>
+        <w:tc>
+          <w:tcPr>
+            <w:tcW w:w="3440" w:type="dxa"/>
+            <w:gridSpan w:val="2"/>
+            <w:vAlign w:val="center"/>
+          </w:tcPr>
+          <w:p>
+            <w:pPr>
+              <w:spacing w:before="100" w:beforeAutospacing="1" w:after="100" w:afterAutospacing="1" w:line="240" w:lineRule="auto"/>
+              <w:jc w:val="left"/>
+              <w:outlineLvl w:val="2"/>
+              <w:rPr>
+                <w:rFonts w:eastAsia="Times New Roman" w:cs="Times New Roman"/>
+                <w:sz w:val="24"/>
+                <w:szCs w:val="24"/>
+              </w:rPr>
+            </w:pPr>
+          </w:p>
+        </w:tc>
+        <w:tc>
+          <w:tcPr>
+            <w:tcW w:w="3111" w:type="dxa"/>
+            <w:vAlign w:val="center"/>
+          </w:tcPr>
+          <w:p>
+            <w:pPr>
+              <w:spacing w:before="100" w:beforeAutospacing="1" w:after="100" w:afterAutospacing="1" w:line="240" w:lineRule="auto"/>
+              <w:jc w:val="left"/>
+              <w:outlineLvl w:val="2"/>
+              <w:rPr>
+                <w:rFonts w:eastAsia="Times New Roman" w:cs="Times New Roman"/>
+                <w:sz w:val="24"/>
+                <w:szCs w:val="24"/>
+              </w:rPr>
+            </w:pPr>
+            <w:r>
+              <w:rPr>
+                <w:rFonts w:eastAsia="Times New Roman" w:cs="Times New Roman"/>
+                <w:sz w:val="24"/>
+                <w:szCs w:val="24"/>
+              </w:rPr>
+              <w:t>Mệt</w:t>
+            </w:r>
+          </w:p>
+        </w:tc>
+        <w:tc>
+          <w:tcPr>
+            <w:tcW w:w="2843" w:type="dxa"/>
+          </w:tcPr>
+          <w:p>
+            <w:pPr>
+              <w:spacing w:before="100" w:beforeAutospacing="1" w:after="100" w:afterAutospacing="1" w:line="240" w:lineRule="auto"/>
+              <w:jc w:val="left"/>
+              <w:outlineLvl w:val="2"/>
+              <w:rPr>
+                <w:rFonts w:eastAsia="Times New Roman" w:cs="Times New Roman"/>
+                <w:sz w:val="24"/>
+                <w:szCs w:val="24"/>
+              </w:rPr>
+            </w:pPr>
+          </w:p>
+        </w:tc>
+      </w:tr>
+      <w:tr>
+        <w:tc>
+          <w:tcPr>
+            <w:tcW w:w="3440" w:type="dxa"/>
+            <w:gridSpan w:val="2"/>
+            <w:vAlign w:val="center"/>
+          </w:tcPr>
+          <w:p>
+            <w:pPr>
+              <w:spacing w:before="100" w:beforeAutospacing="1" w:after="100" w:afterAutospacing="1" w:line="240" w:lineRule="auto"/>
+              <w:jc w:val="left"/>
+              <w:outlineLvl w:val="2"/>
+              <w:rPr>
+                <w:rFonts w:eastAsia="Times New Roman" w:cs="Times New Roman"/>
+                <w:sz w:val="24"/>
+                <w:szCs w:val="24"/>
+              </w:rPr>
+            </w:pPr>
+          </w:p>
+        </w:tc>
+        <w:tc>
+          <w:tcPr>
+            <w:tcW w:w="3111" w:type="dxa"/>
+            <w:vAlign w:val="center"/>
+          </w:tcPr>
+          <w:p>
+            <w:pPr>
+              <w:spacing w:before="100" w:beforeAutospacing="1" w:after="100" w:afterAutospacing="1" w:line="240" w:lineRule="auto"/>
+              <w:jc w:val="left"/>
+              <w:outlineLvl w:val="2"/>
+              <w:rPr>
+                <w:rFonts w:eastAsia="Times New Roman" w:cs="Times New Roman"/>
+                <w:sz w:val="24"/>
+                <w:szCs w:val="24"/>
+              </w:rPr>
+            </w:pPr>
+            <w:r>
+              <w:rPr>
+                <w:rFonts w:eastAsia="Times New Roman" w:cs="Times New Roman"/>
+                <w:sz w:val="24"/>
+                <w:szCs w:val="24"/>
+              </w:rPr>
+              <w:t>Đau đầu</w:t>
+            </w:r>
+          </w:p>
+        </w:tc>
+        <w:tc>
+          <w:tcPr>
+            <w:tcW w:w="2843" w:type="dxa"/>
+          </w:tcPr>
+          <w:p>
+            <w:pPr>
+              <w:spacing w:before="100" w:beforeAutospacing="1" w:after="100" w:afterAutospacing="1" w:line="240" w:lineRule="auto"/>
+              <w:jc w:val="left"/>
+              <w:outlineLvl w:val="2"/>
+              <w:rPr>
+                <w:rFonts w:eastAsia="Times New Roman" w:cs="Times New Roman"/>
+                <w:sz w:val="24"/>
+                <w:szCs w:val="24"/>
+              </w:rPr>
+            </w:pPr>
+          </w:p>
+        </w:tc>
+      </w:tr>
+      <w:tr>
+        <w:tc>
+          <w:tcPr>
+            <w:tcW w:w="3440" w:type="dxa"/>
+            <w:gridSpan w:val="2"/>
+            <w:vAlign w:val="center"/>
+          </w:tcPr>
+          <w:p>
+            <w:pPr>
+              <w:spacing w:before="100" w:beforeAutospacing="1" w:after="100" w:afterAutospacing="1" w:line="240" w:lineRule="auto"/>
+              <w:jc w:val="left"/>
+              <w:outlineLvl w:val="2"/>
+              <w:rPr>
+                <w:rFonts w:eastAsia="Times New Roman" w:cs="Times New Roman"/>
+                <w:sz w:val="24"/>
+                <w:szCs w:val="24"/>
+              </w:rPr>
+            </w:pPr>
+          </w:p>
+        </w:tc>
+        <w:tc>
+          <w:tcPr>
+            <w:tcW w:w="3111" w:type="dxa"/>
+            <w:vAlign w:val="center"/>
+          </w:tcPr>
+          <w:p>
+            <w:pPr>
+              <w:spacing w:before="100" w:beforeAutospacing="1" w:after="100" w:afterAutospacing="1" w:line="240" w:lineRule="auto"/>
+              <w:jc w:val="left"/>
+              <w:outlineLvl w:val="2"/>
+              <w:rPr>
+                <w:rFonts w:eastAsia="Times New Roman" w:cs="Times New Roman"/>
+                <w:sz w:val="24"/>
+                <w:szCs w:val="24"/>
+              </w:rPr>
+            </w:pPr>
+            <w:r>
+              <w:rPr>
+                <w:rFonts w:eastAsia="Times New Roman" w:cs="Times New Roman"/>
+                <w:sz w:val="24"/>
+                <w:szCs w:val="24"/>
+              </w:rPr>
+              <w:t>Đau bụng</w:t>
+            </w:r>
+          </w:p>
+        </w:tc>
+        <w:tc>
+          <w:tcPr>
+            <w:tcW w:w="2843" w:type="dxa"/>
+          </w:tcPr>
+          <w:p>
+            <w:pPr>
+              <w:spacing w:before="100" w:beforeAutospacing="1" w:after="100" w:afterAutospacing="1" w:line="240" w:lineRule="auto"/>
+              <w:jc w:val="left"/>
+              <w:outlineLvl w:val="2"/>
+              <w:rPr>
+                <w:rFonts w:eastAsia="Times New Roman" w:cs="Times New Roman"/>
+                <w:sz w:val="24"/>
+                <w:szCs w:val="24"/>
+              </w:rPr>
+            </w:pPr>
+          </w:p>
+        </w:tc>
+      </w:tr>
+      <w:tr>
+        <w:tc>
+          <w:tcPr>
+            <w:tcW w:w="3440" w:type="dxa"/>
+            <w:gridSpan w:val="2"/>
+            <w:vAlign w:val="center"/>
+          </w:tcPr>
+          <w:p>
+            <w:pPr>
+              <w:spacing w:before="100" w:beforeAutospacing="1" w:after="100" w:afterAutospacing="1" w:line="240" w:lineRule="auto"/>
+              <w:jc w:val="left"/>
+              <w:outlineLvl w:val="2"/>
+              <w:rPr>
+                <w:rFonts w:eastAsia="Times New Roman" w:cs="Times New Roman"/>
+                <w:sz w:val="24"/>
+                <w:szCs w:val="24"/>
+              </w:rPr>
+            </w:pPr>
+          </w:p>
+        </w:tc>
+        <w:tc>
+          <w:tcPr>
+            <w:tcW w:w="3111" w:type="dxa"/>
+            <w:vAlign w:val="center"/>
+          </w:tcPr>
+          <w:p>
+            <w:pPr>
+              <w:spacing w:before="100" w:beforeAutospacing="1" w:after="100" w:afterAutospacing="1" w:line="240" w:lineRule="auto"/>
+              <w:jc w:val="left"/>
+              <w:outlineLvl w:val="2"/>
+              <w:rPr>
+                <w:rFonts w:eastAsia="Times New Roman" w:cs="Times New Roman"/>
+                <w:sz w:val="24"/>
+                <w:szCs w:val="24"/>
+              </w:rPr>
+            </w:pPr>
+            <w:r>
+              <w:rPr>
+                <w:rFonts w:eastAsia="Times New Roman" w:cs="Times New Roman"/>
+                <w:sz w:val="24"/>
+                <w:szCs w:val="24"/>
+              </w:rPr>
+              <w:t>Đau lưng</w:t>
+            </w:r>
+          </w:p>
+        </w:tc>
+        <w:tc>
+          <w:tcPr>
+            <w:tcW w:w="2843" w:type="dxa"/>
+          </w:tcPr>
+          <w:p>
+            <w:pPr>
+              <w:spacing w:before="100" w:beforeAutospacing="1" w:after="100" w:afterAutospacing="1" w:line="240" w:lineRule="auto"/>
+              <w:jc w:val="left"/>
+              <w:outlineLvl w:val="2"/>
+              <w:rPr>
+                <w:rFonts w:eastAsia="Times New Roman" w:cs="Times New Roman"/>
+                <w:sz w:val="24"/>
+                <w:szCs w:val="24"/>
+              </w:rPr>
+            </w:pPr>
+          </w:p>
+        </w:tc>
+      </w:tr>
+      <w:tr>
+        <w:tc>
+          <w:tcPr>
+            <w:tcW w:w="3440" w:type="dxa"/>
+            <w:gridSpan w:val="2"/>
+            <w:vAlign w:val="center"/>
+          </w:tcPr>
+          <w:p>
+            <w:pPr>
+              <w:spacing w:before="100" w:beforeAutospacing="1" w:after="100" w:afterAutospacing="1" w:line="240" w:lineRule="auto"/>
+              <w:jc w:val="left"/>
+              <w:outlineLvl w:val="2"/>
+              <w:rPr>
+                <w:rFonts w:eastAsia="Times New Roman" w:cs="Times New Roman"/>
+                <w:sz w:val="24"/>
+                <w:szCs w:val="24"/>
+              </w:rPr>
+            </w:pPr>
+          </w:p>
+        </w:tc>
+        <w:tc>
+          <w:tcPr>
+            <w:tcW w:w="3111" w:type="dxa"/>
+            <w:vAlign w:val="center"/>
+          </w:tcPr>
+          <w:p>
+            <w:pPr>
+              <w:spacing w:before="100" w:beforeAutospacing="1" w:after="100" w:afterAutospacing="1" w:line="240" w:lineRule="auto"/>
+              <w:jc w:val="left"/>
+              <w:outlineLvl w:val="2"/>
+              <w:rPr>
+                <w:rFonts w:eastAsia="Times New Roman" w:cs="Times New Roman"/>
+                <w:sz w:val="24"/>
+                <w:szCs w:val="24"/>
+              </w:rPr>
+            </w:pPr>
+            <w:r>
+              <w:rPr>
+                <w:rFonts w:eastAsia="Times New Roman" w:cs="Times New Roman"/>
+                <w:sz w:val="24"/>
+                <w:szCs w:val="24"/>
+              </w:rPr>
+              <w:t>Buồn nôn</w:t>
+            </w:r>
+          </w:p>
+        </w:tc>
+        <w:tc>
+          <w:tcPr>
+            <w:tcW w:w="2843" w:type="dxa"/>
+          </w:tcPr>
+          <w:p>
+            <w:pPr>
+              <w:spacing w:before="100" w:beforeAutospacing="1" w:after="100" w:afterAutospacing="1" w:line="240" w:lineRule="auto"/>
+              <w:jc w:val="left"/>
+              <w:outlineLvl w:val="2"/>
+              <w:rPr>
+                <w:rFonts w:eastAsia="Times New Roman" w:cs="Times New Roman"/>
+                <w:sz w:val="24"/>
+                <w:szCs w:val="24"/>
+              </w:rPr>
+            </w:pPr>
+          </w:p>
+        </w:tc>
+      </w:tr>
+      <w:tr>
+        <w:tc>
+          <w:tcPr>
+            <w:tcW w:w="3440" w:type="dxa"/>
+            <w:gridSpan w:val="2"/>
+            <w:vAlign w:val="center"/>
+          </w:tcPr>
+          <w:p>
+            <w:pPr>
+              <w:spacing w:before="100" w:beforeAutospacing="1" w:after="100" w:afterAutospacing="1" w:line="240" w:lineRule="auto"/>
+              <w:jc w:val="left"/>
+              <w:outlineLvl w:val="2"/>
+              <w:rPr>
+                <w:rFonts w:eastAsia="Times New Roman" w:cs="Times New Roman"/>
+                <w:sz w:val="24"/>
+                <w:szCs w:val="24"/>
+              </w:rPr>
+            </w:pPr>
+          </w:p>
+        </w:tc>
+        <w:tc>
+          <w:tcPr>
+            <w:tcW w:w="3111" w:type="dxa"/>
+            <w:vAlign w:val="center"/>
+          </w:tcPr>
+          <w:p>
+            <w:pPr>
+              <w:spacing w:before="100" w:beforeAutospacing="1" w:after="100" w:afterAutospacing="1" w:line="240" w:lineRule="auto"/>
+              <w:jc w:val="left"/>
+              <w:outlineLvl w:val="2"/>
+              <w:rPr>
+                <w:rFonts w:eastAsia="Times New Roman" w:cs="Times New Roman"/>
+                <w:sz w:val="24"/>
+                <w:szCs w:val="24"/>
+              </w:rPr>
+            </w:pPr>
+            <w:r>
+              <w:rPr>
+                <w:rFonts w:eastAsia="Times New Roman" w:cs="Times New Roman"/>
+                <w:sz w:val="24"/>
+                <w:szCs w:val="24"/>
+              </w:rPr>
+              <w:t>Chóng mặt</w:t>
+            </w:r>
+          </w:p>
+        </w:tc>
+        <w:tc>
+          <w:tcPr>
+            <w:tcW w:w="2843" w:type="dxa"/>
+          </w:tcPr>
+          <w:p>
+            <w:pPr>
+              <w:spacing w:before="100" w:beforeAutospacing="1" w:after="100" w:afterAutospacing="1" w:line="240" w:lineRule="auto"/>
+              <w:jc w:val="left"/>
+              <w:outlineLvl w:val="2"/>
+              <w:rPr>
+                <w:rFonts w:eastAsia="Times New Roman" w:cs="Times New Roman"/>
+                <w:sz w:val="24"/>
+                <w:szCs w:val="24"/>
+              </w:rPr>
+            </w:pPr>
+          </w:p>
+        </w:tc>
+      </w:tr>
+      <w:tr>
+        <w:tc>
+          <w:tcPr>
+            <w:tcW w:w="3440" w:type="dxa"/>
+            <w:gridSpan w:val="2"/>
+            <w:vAlign w:val="center"/>
+          </w:tcPr>
+          <w:p>
+            <w:pPr>
+              <w:spacing w:before="100" w:beforeAutospacing="1" w:after="100" w:afterAutospacing="1" w:line="240" w:lineRule="auto"/>
+              <w:jc w:val="left"/>
+              <w:outlineLvl w:val="2"/>
+              <w:rPr>
+                <w:rFonts w:eastAsia="Times New Roman" w:cs="Times New Roman"/>
+                <w:sz w:val="24"/>
+                <w:szCs w:val="24"/>
+              </w:rPr>
+            </w:pPr>
+          </w:p>
+        </w:tc>
+        <w:tc>
+          <w:tcPr>
+            <w:tcW w:w="3111" w:type="dxa"/>
+            <w:vAlign w:val="center"/>
+          </w:tcPr>
+          <w:p>
+            <w:pPr>
+              <w:spacing w:before="100" w:beforeAutospacing="1" w:after="100" w:afterAutospacing="1" w:line="240" w:lineRule="auto"/>
+              <w:jc w:val="left"/>
+              <w:outlineLvl w:val="2"/>
+              <w:rPr>
+                <w:rFonts w:eastAsia="Times New Roman" w:cs="Times New Roman"/>
+                <w:sz w:val="24"/>
+                <w:szCs w:val="24"/>
+              </w:rPr>
+            </w:pPr>
+            <w:r>
+              <w:rPr>
+                <w:rFonts w:eastAsia="Times New Roman" w:cs="Times New Roman"/>
+                <w:sz w:val="24"/>
+                <w:szCs w:val="24"/>
+              </w:rPr>
+              <w:t>Nổi mụn</w:t>
+            </w:r>
+          </w:p>
+        </w:tc>
+        <w:tc>
+          <w:tcPr>
+            <w:tcW w:w="2843" w:type="dxa"/>
+          </w:tcPr>
+          <w:p>
+            <w:pPr>
+              <w:spacing w:before="100" w:beforeAutospacing="1" w:after="100" w:afterAutospacing="1" w:line="240" w:lineRule="auto"/>
+              <w:jc w:val="left"/>
+              <w:outlineLvl w:val="2"/>
+              <w:rPr>
+                <w:rFonts w:eastAsia="Times New Roman" w:cs="Times New Roman"/>
+                <w:sz w:val="24"/>
+                <w:szCs w:val="24"/>
+              </w:rPr>
+            </w:pPr>
+          </w:p>
+        </w:tc>
+      </w:tr>
+      <w:tr>
+        <w:tc>
+          <w:tcPr>
+            <w:tcW w:w="3440" w:type="dxa"/>
+            <w:gridSpan w:val="2"/>
+            <w:vAlign w:val="center"/>
+          </w:tcPr>
+          <w:p>
+            <w:pPr>
+              <w:spacing w:before="100" w:beforeAutospacing="1" w:after="100" w:afterAutospacing="1" w:line="240" w:lineRule="auto"/>
+              <w:jc w:val="left"/>
+              <w:outlineLvl w:val="2"/>
+              <w:rPr>
+                <w:rFonts w:eastAsia="Times New Roman" w:cs="Times New Roman"/>
+                <w:sz w:val="24"/>
+                <w:szCs w:val="24"/>
+              </w:rPr>
+            </w:pPr>
+          </w:p>
+        </w:tc>
+        <w:tc>
+          <w:tcPr>
+            <w:tcW w:w="3111" w:type="dxa"/>
+            <w:vAlign w:val="center"/>
+          </w:tcPr>
+          <w:p>
+            <w:pPr>
+              <w:spacing w:before="100" w:beforeAutospacing="1" w:after="100" w:afterAutospacing="1" w:line="240" w:lineRule="auto"/>
+              <w:jc w:val="left"/>
+              <w:outlineLvl w:val="2"/>
+              <w:rPr>
+                <w:rFonts w:eastAsia="Times New Roman" w:cs="Times New Roman"/>
+                <w:sz w:val="24"/>
+                <w:szCs w:val="24"/>
+              </w:rPr>
+            </w:pPr>
+            <w:r>
+              <w:rPr>
+                <w:rFonts w:eastAsia="Times New Roman" w:cs="Times New Roman"/>
+                <w:sz w:val="24"/>
+                <w:szCs w:val="24"/>
+              </w:rPr>
+              <w:t>Khó chịu</w:t>
+            </w:r>
+          </w:p>
+        </w:tc>
+        <w:tc>
+          <w:tcPr>
+            <w:tcW w:w="2843" w:type="dxa"/>
+          </w:tcPr>
+          <w:p>
+            <w:pPr>
+              <w:spacing w:before="100" w:beforeAutospacing="1" w:after="100" w:afterAutospacing="1" w:line="240" w:lineRule="auto"/>
+              <w:jc w:val="left"/>
+              <w:outlineLvl w:val="2"/>
+              <w:rPr>
+                <w:rFonts w:eastAsia="Times New Roman" w:cs="Times New Roman"/>
+                <w:sz w:val="24"/>
+                <w:szCs w:val="24"/>
+              </w:rPr>
+            </w:pPr>
+          </w:p>
+        </w:tc>
+      </w:tr>
+      <w:tr>
+        <w:tc>
+          <w:tcPr>
+            <w:tcW w:w="3440" w:type="dxa"/>
+            <w:gridSpan w:val="2"/>
+            <w:vAlign w:val="center"/>
+          </w:tcPr>
+          <w:p>
+            <w:pPr>
+              <w:spacing w:before="100" w:beforeAutospacing="1" w:after="100" w:afterAutospacing="1" w:line="240" w:lineRule="auto"/>
+              <w:jc w:val="left"/>
+              <w:outlineLvl w:val="2"/>
+              <w:rPr>
+                <w:rFonts w:eastAsia="Times New Roman" w:cs="Times New Roman"/>
+                <w:sz w:val="24"/>
+                <w:szCs w:val="24"/>
+              </w:rPr>
+            </w:pPr>
+          </w:p>
+        </w:tc>
+        <w:tc>
+          <w:tcPr>
+            <w:tcW w:w="3111" w:type="dxa"/>
+            <w:vAlign w:val="center"/>
+          </w:tcPr>
+          <w:p>
+            <w:pPr>
+              <w:spacing w:before="100" w:beforeAutospacing="1" w:after="100" w:afterAutospacing="1" w:line="240" w:lineRule="auto"/>
+              <w:jc w:val="left"/>
+              <w:outlineLvl w:val="2"/>
               <w:rPr>
                 <w:rFonts w:eastAsia="Times New Roman" w:cs="Times New Roman"/>
                 <w:sz w:val="24"/>
@@ -10913,34 +12924,147 @@
         </w:tc>
         <w:tc>
           <w:tcPr>
-            <w:tcW w:w="7586" w:type="dxa"/>
-          </w:tcPr>
-          <w:p>
-            <w:pPr>
-              <w:spacing w:after="0" w:line="240" w:lineRule="auto"/>
-              <w:jc w:val="left"/>
-              <w:rPr>
-                <w:rFonts w:ascii="Segoe UI Emoji" w:hAnsi="Segoe UI Emoji" w:cs="Segoe UI Emoji"/>
-                <w:sz w:val="24"/>
-                <w:szCs w:val="24"/>
-              </w:rPr>
-            </w:pPr>
-            <w:r>
-              <w:rPr>
-                <w:rFonts w:ascii="Segoe UI Emoji" w:hAnsi="Segoe UI Emoji" w:cs="Segoe UI Emoji"/>
-                <w:sz w:val="24"/>
-                <w:szCs w:val="24"/>
-              </w:rPr>
-              <w:t>= s</w:t>
-            </w:r>
-            <w:r>
-              <w:rPr>
-                <w:rFonts w:ascii="Calibri" w:hAnsi="Calibri" w:cs="Calibri"/>
-                <w:sz w:val="24"/>
-                <w:szCs w:val="24"/>
-              </w:rPr>
-              <w:t>ố ngày check in trong 30 ngày gần nhất, tính từ ngày today-1</w:t>
-            </w:r>
+            <w:tcW w:w="2843" w:type="dxa"/>
+          </w:tcPr>
+          <w:p>
+            <w:pPr>
+              <w:spacing w:before="100" w:beforeAutospacing="1" w:after="100" w:afterAutospacing="1" w:line="240" w:lineRule="auto"/>
+              <w:jc w:val="left"/>
+              <w:outlineLvl w:val="2"/>
+              <w:rPr>
+                <w:rFonts w:eastAsia="Times New Roman" w:cs="Times New Roman"/>
+                <w:sz w:val="24"/>
+                <w:szCs w:val="24"/>
+              </w:rPr>
+            </w:pPr>
+          </w:p>
+        </w:tc>
+      </w:tr>
+      <w:tr>
+        <w:tc>
+          <w:tcPr>
+            <w:tcW w:w="3440" w:type="dxa"/>
+            <w:gridSpan w:val="2"/>
+            <w:vAlign w:val="center"/>
+          </w:tcPr>
+          <w:p>
+            <w:pPr>
+              <w:spacing w:before="100" w:beforeAutospacing="1" w:after="100" w:afterAutospacing="1" w:line="240" w:lineRule="auto"/>
+              <w:jc w:val="left"/>
+              <w:outlineLvl w:val="2"/>
+              <w:rPr>
+                <w:rFonts w:eastAsia="Times New Roman" w:cs="Times New Roman"/>
+                <w:sz w:val="24"/>
+                <w:szCs w:val="24"/>
+              </w:rPr>
+            </w:pPr>
+          </w:p>
+        </w:tc>
+        <w:tc>
+          <w:tcPr>
+            <w:tcW w:w="3111" w:type="dxa"/>
+            <w:vAlign w:val="center"/>
+          </w:tcPr>
+          <w:p>
+            <w:pPr>
+              <w:spacing w:before="100" w:beforeAutospacing="1" w:after="100" w:afterAutospacing="1" w:line="240" w:lineRule="auto"/>
+              <w:jc w:val="left"/>
+              <w:outlineLvl w:val="2"/>
+              <w:rPr>
+                <w:rFonts w:eastAsia="Times New Roman" w:cs="Times New Roman"/>
+                <w:sz w:val="24"/>
+                <w:szCs w:val="24"/>
+              </w:rPr>
+            </w:pPr>
+            <w:r>
+              <w:rPr>
+                <w:rFonts w:eastAsia="Times New Roman" w:cs="Times New Roman"/>
+                <w:sz w:val="24"/>
+                <w:szCs w:val="24"/>
+              </w:rPr>
+              <w:t>Không có dữ liệu cơ thể</w:t>
+            </w:r>
+          </w:p>
+        </w:tc>
+        <w:tc>
+          <w:tcPr>
+            <w:tcW w:w="2843" w:type="dxa"/>
+          </w:tcPr>
+          <w:p>
+            <w:pPr>
+              <w:spacing w:before="100" w:beforeAutospacing="1" w:after="100" w:afterAutospacing="1" w:line="240" w:lineRule="auto"/>
+              <w:jc w:val="left"/>
+              <w:outlineLvl w:val="2"/>
+              <w:rPr>
+                <w:rFonts w:eastAsia="Times New Roman" w:cs="Times New Roman"/>
+                <w:sz w:val="24"/>
+                <w:szCs w:val="24"/>
+              </w:rPr>
+            </w:pPr>
+          </w:p>
+        </w:tc>
+      </w:tr>
+      <w:tr>
+        <w:tc>
+          <w:tcPr>
+            <w:tcW w:w="3440" w:type="dxa"/>
+            <w:gridSpan w:val="2"/>
+            <w:vAlign w:val="center"/>
+          </w:tcPr>
+          <w:p>
+            <w:pPr>
+              <w:spacing w:before="100" w:beforeAutospacing="1" w:after="100" w:afterAutospacing="1" w:line="240" w:lineRule="auto"/>
+              <w:jc w:val="left"/>
+              <w:outlineLvl w:val="2"/>
+              <w:rPr>
+                <w:rFonts w:eastAsia="Times New Roman" w:cs="Times New Roman"/>
+                <w:sz w:val="24"/>
+                <w:szCs w:val="24"/>
+              </w:rPr>
+            </w:pPr>
+          </w:p>
+        </w:tc>
+        <w:tc>
+          <w:tcPr>
+            <w:tcW w:w="3111" w:type="dxa"/>
+            <w:vAlign w:val="center"/>
+          </w:tcPr>
+          <w:p>
+            <w:pPr>
+              <w:spacing w:before="100" w:beforeAutospacing="1" w:after="100" w:afterAutospacing="1" w:line="240" w:lineRule="auto"/>
+              <w:jc w:val="left"/>
+              <w:outlineLvl w:val="2"/>
+              <w:rPr>
+                <w:rFonts w:eastAsia="Times New Roman" w:cs="Times New Roman"/>
+                <w:sz w:val="24"/>
+                <w:szCs w:val="24"/>
+              </w:rPr>
+            </w:pPr>
+            <w:r>
+              <w:rPr>
+                <w:rFonts w:eastAsia="Times New Roman" w:cs="Times New Roman"/>
+                <w:sz w:val="24"/>
+                <w:szCs w:val="24"/>
+              </w:rPr>
+              <w:t>Không có dữ liệu cảm xúc</w:t>
+            </w:r>
+          </w:p>
+        </w:tc>
+        <w:tc>
+          <w:tcPr>
+            <w:tcW w:w="2843" w:type="dxa"/>
+          </w:tcPr>
+          <w:p>
+            <w:pPr>
+              <w:spacing w:before="100" w:beforeAutospacing="1" w:after="100" w:afterAutospacing="1" w:line="240" w:lineRule="auto"/>
+              <w:jc w:val="left"/>
+              <w:outlineLvl w:val="2"/>
+              <w:rPr>
+                <w:rFonts w:eastAsia="Times New Roman" w:cs="Times New Roman"/>
+                <w:sz w:val="24"/>
+                <w:szCs w:val="24"/>
+              </w:rPr>
+            </w:pPr>
           </w:p>
         </w:tc>
       </w:tr>
@@ -10954,16 +13078,32 @@
           <w:szCs w:val="24"/>
         </w:rPr>
       </w:pPr>
+      <w:r>
+        <w:rPr>
+          <w:rFonts w:cs="Times New Roman"/>
+          <w:b/>
+          <w:sz w:val="24"/>
+          <w:szCs w:val="24"/>
+        </w:rPr>
+        <w:t>[Xem chi tiết tất cả triệu chứng]</w:t>
+      </w:r>
     </w:p>
     <w:p>
       <w:pPr>
         <w:rPr>
           <w:rFonts w:cs="Times New Roman"/>
-          <w:b/>
-          <w:sz w:val="24"/>
-          <w:szCs w:val="24"/>
-        </w:rPr>
-      </w:pPr>
+          <w:sz w:val="24"/>
+          <w:szCs w:val="24"/>
+        </w:rPr>
+      </w:pPr>
+      <w:r>
+        <w:rPr>
+          <w:rFonts w:cs="Times New Roman"/>
+          <w:sz w:val="24"/>
+          <w:szCs w:val="24"/>
+        </w:rPr>
+        <w:t xml:space="preserve">Khi người dùng click vào button </w:t>
+      </w:r>
       <w:r>
         <w:rPr>
           <w:rFonts w:cs="Times New Roman"/>
@@ -10971,19 +13111,26 @@
           <w:sz w:val="24"/>
           <w:szCs w:val="24"/>
         </w:rPr>
-        <w:t>C.</w:t>
-      </w:r>
-      <w:r>
+        <w:t xml:space="preserve">[Xem chi tiết tất cả triệu chứng] </w:t>
+      </w:r>
+      <w:r>
+        <w:rPr>
+          <w:rFonts w:cs="Times New Roman"/>
+          <w:sz w:val="24"/>
+          <w:szCs w:val="24"/>
+        </w:rPr>
+        <w:t>hiển thị tất cả các trạng thái đã check in theo dạng liệt kê.</w:t>
+      </w:r>
+    </w:p>
+    <w:p>
+      <w:pPr>
         <w:rPr>
           <w:rFonts w:cs="Times New Roman"/>
           <w:b/>
           <w:sz w:val="24"/>
           <w:szCs w:val="24"/>
         </w:rPr>
-        <w:t xml:space="preserve"> </w:t>
-      </w:r>
-      <w:bookmarkStart w:id="6" w:name="_Hlk223687764"/>
-      <w:bookmarkStart w:id="7" w:name="_GoBack"/>
+      </w:pPr>
       <w:r>
         <w:rPr>
           <w:rFonts w:cs="Times New Roman"/>
@@ -10991,67 +13138,76 @@
           <w:sz w:val="24"/>
           <w:szCs w:val="24"/>
         </w:rPr>
-        <w:t>Thư viện kiến thức</w:t>
-      </w:r>
-      <w:bookmarkEnd w:id="6"/>
+        <w:t>Mách nhỏ phụ huynh</w:t>
+      </w:r>
     </w:p>
     <w:p>
       <w:pPr>
-        <w:spacing w:line="288" w:lineRule="auto"/>
-        <w:rPr>
-          <w:sz w:val="24"/>
-          <w:szCs w:val="24"/>
-        </w:rPr>
-      </w:pPr>
-      <w:r>
         <w:rPr>
           <w:rFonts w:cs="Times New Roman"/>
           <w:sz w:val="24"/>
           <w:szCs w:val="24"/>
         </w:rPr>
-        <w:t xml:space="preserve">Dưới các tên sub tab hiển thị thanh tỷ lệ số bài đã đọc: </w:t>
-      </w:r>
-      <w:r>
-        <w:rPr>
-          <w:sz w:val="24"/>
-          <w:szCs w:val="24"/>
-        </w:rPr>
-        <w:t>x/y bài đã đọc, trong đó x là số bài đã đọc, y là tổng số bài viết trong Mục này</w:t>
+      </w:pPr>
+      <w:r>
+        <w:rPr>
+          <w:rFonts w:cs="Times New Roman"/>
+          <w:sz w:val="24"/>
+          <w:szCs w:val="24"/>
+        </w:rPr>
+        <w:t xml:space="preserve">App </w:t>
+      </w:r>
+      <w:r>
+        <w:rPr>
+          <w:rFonts w:cs="Times New Roman"/>
+          <w:sz w:val="24"/>
+          <w:szCs w:val="24"/>
+        </w:rPr>
+        <w:t>thực hiện gợi ý theo mẫu sẵn có, tần suất 1 tuần/lần vào thứ 7 hàng tuần.</w:t>
       </w:r>
     </w:p>
     <w:p>
       <w:pPr>
         <w:rPr>
-          <w:sz w:val="24"/>
-          <w:szCs w:val="24"/>
-        </w:rPr>
-      </w:pPr>
-      <w:r>
-        <w:rPr>
           <w:rFonts w:cs="Times New Roman"/>
-          <w:sz w:val="24"/>
-          <w:szCs w:val="24"/>
-        </w:rPr>
-        <w:t xml:space="preserve">Sub tab 1: </w:t>
-      </w:r>
+          <w:b/>
+          <w:sz w:val="24"/>
+          <w:szCs w:val="24"/>
+        </w:rPr>
+      </w:pPr>
       <w:r>
         <w:rPr>
           <w:rFonts w:cs="Times New Roman"/>
-          <w:sz w:val="24"/>
-          <w:szCs w:val="24"/>
-        </w:rPr>
-        <w:t>Nuôi dưỡng tinh thần</w:t>
-      </w:r>
-      <w:r>
-        <w:rPr>
+          <w:b/>
+          <w:sz w:val="24"/>
+          <w:szCs w:val="24"/>
+        </w:rPr>
+        <w:t>C.</w:t>
+      </w:r>
+      <w:r>
+        <w:rPr>
+          <w:rFonts w:cs="Times New Roman"/>
+          <w:b/>
           <w:sz w:val="24"/>
           <w:szCs w:val="24"/>
         </w:rPr>
         <w:t xml:space="preserve"> </w:t>
       </w:r>
+      <w:bookmarkStart w:id="10" w:name="_Hlk223687764"/>
+      <w:r>
+        <w:rPr>
+          <w:rFonts w:cs="Times New Roman"/>
+          <w:b/>
+          <w:sz w:val="24"/>
+          <w:szCs w:val="24"/>
+        </w:rPr>
+        <w:t>Thư viện kiến thức</w:t>
+      </w:r>
+      <w:bookmarkEnd w:id="10"/>
     </w:p>
     <w:p>
       <w:pPr>
+        <w:spacing w:line="288" w:lineRule="auto"/>
         <w:rPr>
           <w:sz w:val="24"/>
           <w:szCs w:val="24"/>
@@ -11063,47 +13219,70 @@
           <w:sz w:val="24"/>
           <w:szCs w:val="24"/>
         </w:rPr>
-        <w:t xml:space="preserve">Sub tab 2: </w:t>
-      </w:r>
-      <w:r>
-        <w:rPr>
-          <w:rFonts w:cs="Times New Roman"/>
-          <w:sz w:val="24"/>
-          <w:szCs w:val="24"/>
-        </w:rPr>
-        <w:t>Phát triển thể chất</w:t>
+        <w:lastRenderedPageBreak/>
+        <w:t xml:space="preserve">Dưới các tên sub tab hiển thị thanh tỷ lệ số bài đã đọc: </w:t>
+      </w:r>
+      <w:r>
+        <w:rPr>
+          <w:sz w:val="24"/>
+          <w:szCs w:val="24"/>
+        </w:rPr>
+        <w:t>x/y bài đã đọc, trong đó x là số bài đã đọc, y là tổng số bài viết trong Mục này</w:t>
       </w:r>
     </w:p>
     <w:p>
       <w:pPr>
-        <w:spacing w:line="288" w:lineRule="auto"/>
-        <w:rPr>
-          <w:sz w:val="24"/>
-          <w:szCs w:val="24"/>
-        </w:rPr>
-      </w:pPr>
-      <w:r>
-        <w:rPr>
-          <w:sz w:val="24"/>
-          <w:szCs w:val="24"/>
-        </w:rPr>
-        <w:t>Sub tab 3: Bồi đắp kỹ năng</w:t>
+        <w:rPr>
+          <w:sz w:val="24"/>
+          <w:szCs w:val="24"/>
+        </w:rPr>
+      </w:pPr>
+      <w:r>
+        <w:rPr>
+          <w:rFonts w:cs="Times New Roman"/>
+          <w:sz w:val="24"/>
+          <w:szCs w:val="24"/>
+        </w:rPr>
+        <w:t xml:space="preserve">Sub tab 1: </w:t>
+      </w:r>
+      <w:r>
+        <w:rPr>
+          <w:rFonts w:cs="Times New Roman"/>
+          <w:sz w:val="24"/>
+          <w:szCs w:val="24"/>
+        </w:rPr>
+        <w:t>Nuôi dưỡng tinh thần</w:t>
+      </w:r>
+      <w:r>
+        <w:rPr>
+          <w:sz w:val="24"/>
+          <w:szCs w:val="24"/>
+        </w:rPr>
+        <w:t xml:space="preserve"> </w:t>
       </w:r>
     </w:p>
     <w:p>
       <w:pPr>
-        <w:spacing w:line="288" w:lineRule="auto"/>
-        <w:rPr>
-          <w:sz w:val="24"/>
-          <w:szCs w:val="24"/>
-        </w:rPr>
-      </w:pPr>
-      <w:r>
-        <w:rPr>
-          <w:sz w:val="24"/>
-          <w:szCs w:val="24"/>
-        </w:rPr>
-        <w:t>Sub tab 4: Sự kiện cảnh báo</w:t>
+        <w:rPr>
+          <w:sz w:val="24"/>
+          <w:szCs w:val="24"/>
+        </w:rPr>
+      </w:pPr>
+      <w:r>
+        <w:rPr>
+          <w:rFonts w:cs="Times New Roman"/>
+          <w:sz w:val="24"/>
+          <w:szCs w:val="24"/>
+        </w:rPr>
+        <w:t xml:space="preserve">Sub tab 2: </w:t>
+      </w:r>
+      <w:r>
+        <w:rPr>
+          <w:rFonts w:cs="Times New Roman"/>
+          <w:sz w:val="24"/>
+          <w:szCs w:val="24"/>
+        </w:rPr>
+        <w:t>Phát triển thể chất</w:t>
       </w:r>
     </w:p>
     <w:p>
@@ -11119,49 +13298,7 @@
           <w:sz w:val="24"/>
           <w:szCs w:val="24"/>
         </w:rPr>
-        <w:t xml:space="preserve">Sub tab </w:t>
-      </w:r>
-      <w:r>
-        <w:rPr>
-          <w:sz w:val="24"/>
-          <w:szCs w:val="24"/>
-        </w:rPr>
-        <w:t>5</w:t>
-      </w:r>
-      <w:r>
-        <w:rPr>
-          <w:sz w:val="24"/>
-          <w:szCs w:val="24"/>
-        </w:rPr>
-        <w:t xml:space="preserve">: </w:t>
-      </w:r>
-      <w:r>
-        <w:rPr>
-          <w:sz w:val="24"/>
-          <w:szCs w:val="24"/>
-        </w:rPr>
-        <w:t>Bài đọc đã lưu</w:t>
-      </w:r>
-      <w:r>
-        <w:rPr>
-          <w:sz w:val="24"/>
-          <w:szCs w:val="24"/>
-        </w:rPr>
-        <w:t xml:space="preserve"> – “</w:t>
-      </w:r>
-      <w:r>
-        <w:rPr>
-          <w:sz w:val="24"/>
-          <w:szCs w:val="24"/>
-        </w:rPr>
-        <w:t>Xem lại các bài viết quan trọng đã lưu ở đây</w:t>
-      </w:r>
-      <w:r>
-        <w:rPr>
-          <w:sz w:val="24"/>
-          <w:szCs w:val="24"/>
-        </w:rPr>
-        <w:t>”</w:t>
+        <w:t>Sub tab 3: Bồi đắp kỹ năng</w:t>
       </w:r>
     </w:p>
     <w:p>
@@ -11172,124 +13309,12 @@
           <w:szCs w:val="24"/>
         </w:rPr>
       </w:pPr>
-      <w:bookmarkStart w:id="8" w:name="_Hlk223687662"/>
-      <w:r>
-        <w:rPr>
-          <w:sz w:val="24"/>
-          <w:szCs w:val="24"/>
-        </w:rPr>
-        <w:t>Tab hiển thị các nội dung kiến thức theo chủ đề</w:t>
-      </w:r>
-      <w:r>
-        <w:rPr>
-          <w:sz w:val="24"/>
-          <w:szCs w:val="24"/>
-        </w:rPr>
-        <w:t xml:space="preserve">. Các bài viết </w:t>
-      </w:r>
-      <w:r>
-        <w:rPr>
-          <w:sz w:val="24"/>
-          <w:szCs w:val="24"/>
-        </w:rPr>
-        <w:t xml:space="preserve">có </w:t>
-      </w:r>
-      <w:r>
-        <w:rPr>
-          <w:sz w:val="24"/>
-          <w:szCs w:val="24"/>
-        </w:rPr>
-        <w:t>hiển thị 1 phần nội dung</w:t>
-      </w:r>
-      <w:r>
-        <w:rPr>
-          <w:sz w:val="24"/>
-          <w:szCs w:val="24"/>
-        </w:rPr>
-        <w:t xml:space="preserve"> và button "Xem chi tiết" để đọc toàn bộ bài viết</w:t>
-      </w:r>
-      <w:r>
-        <w:rPr>
-          <w:sz w:val="24"/>
-          <w:szCs w:val="24"/>
-        </w:rPr>
-        <w:t>.</w:t>
-      </w:r>
-    </w:p>
-    <w:bookmarkEnd w:id="7"/>
-    <w:p>
-      <w:pPr>
-        <w:spacing w:line="288" w:lineRule="auto"/>
-        <w:rPr>
-          <w:sz w:val="24"/>
-          <w:szCs w:val="24"/>
-        </w:rPr>
-      </w:pPr>
-      <w:r>
-        <w:rPr>
-          <w:sz w:val="24"/>
-          <w:szCs w:val="24"/>
-        </w:rPr>
-        <w:lastRenderedPageBreak/>
-        <w:t xml:space="preserve">Mỗi bài viết được gắn tag để phân loại mục đích cho người đọc dễ nhận diện: </w:t>
-      </w:r>
-      <w:r>
-        <w:rPr>
-          <w:sz w:val="24"/>
-          <w:szCs w:val="24"/>
-        </w:rPr>
-        <w:t>hiểu vấn đề của con</w:t>
-      </w:r>
-      <w:r>
-        <w:rPr>
-          <w:sz w:val="24"/>
-          <w:szCs w:val="24"/>
-        </w:rPr>
-        <w:t>/</w:t>
-      </w:r>
-      <w:r>
-        <w:t xml:space="preserve"> </w:t>
-      </w:r>
-      <w:r>
-        <w:rPr>
-          <w:sz w:val="24"/>
-          <w:szCs w:val="24"/>
-        </w:rPr>
-        <w:t>giải thích dữ liệu trong app</w:t>
-      </w:r>
-      <w:r>
-        <w:rPr>
-          <w:sz w:val="24"/>
-          <w:szCs w:val="24"/>
-        </w:rPr>
-        <w:t>/</w:t>
-      </w:r>
-      <w:r>
-        <w:t xml:space="preserve"> </w:t>
-      </w:r>
-      <w:r>
-        <w:rPr>
-          <w:sz w:val="24"/>
-          <w:szCs w:val="24"/>
-        </w:rPr>
-        <w:t>có hành động cụ thể</w:t>
-      </w:r>
-      <w:r>
-        <w:rPr>
-          <w:sz w:val="24"/>
-          <w:szCs w:val="24"/>
-        </w:rPr>
-        <w:t>/</w:t>
-      </w:r>
-      <w:r>
-        <w:t xml:space="preserve"> </w:t>
-      </w:r>
-      <w:r>
-        <w:rPr>
-          <w:sz w:val="24"/>
-          <w:szCs w:val="24"/>
-        </w:rPr>
-        <w:t>biết cách quan sát</w:t>
+      <w:r>
+        <w:rPr>
+          <w:sz w:val="24"/>
+          <w:szCs w:val="24"/>
+        </w:rPr>
+        <w:t>Sub tab 4: Sự kiện cảnh báo</w:t>
       </w:r>
     </w:p>
     <w:p>
@@ -11305,7 +13330,49 @@
           <w:sz w:val="24"/>
           <w:szCs w:val="24"/>
         </w:rPr>
-        <w:t xml:space="preserve">Khi đọc chi tiết bài viết có các button sau: </w:t>
+        <w:t xml:space="preserve">Sub tab </w:t>
+      </w:r>
+      <w:r>
+        <w:rPr>
+          <w:sz w:val="24"/>
+          <w:szCs w:val="24"/>
+        </w:rPr>
+        <w:t>5</w:t>
+      </w:r>
+      <w:r>
+        <w:rPr>
+          <w:sz w:val="24"/>
+          <w:szCs w:val="24"/>
+        </w:rPr>
+        <w:t xml:space="preserve">: </w:t>
+      </w:r>
+      <w:r>
+        <w:rPr>
+          <w:sz w:val="24"/>
+          <w:szCs w:val="24"/>
+        </w:rPr>
+        <w:t>Bài đọc đã lưu</w:t>
+      </w:r>
+      <w:r>
+        <w:rPr>
+          <w:sz w:val="24"/>
+          <w:szCs w:val="24"/>
+        </w:rPr>
+        <w:t xml:space="preserve"> – “</w:t>
+      </w:r>
+      <w:r>
+        <w:rPr>
+          <w:sz w:val="24"/>
+          <w:szCs w:val="24"/>
+        </w:rPr>
+        <w:t>Xem lại các bài viết quan trọng đã lưu ở đây</w:t>
+      </w:r>
+      <w:r>
+        <w:rPr>
+          <w:sz w:val="24"/>
+          <w:szCs w:val="24"/>
+        </w:rPr>
+        <w:t>”</w:t>
       </w:r>
     </w:p>
     <w:p>
@@ -11316,19 +13383,48 @@
           <w:szCs w:val="24"/>
         </w:rPr>
       </w:pPr>
-      <w:r>
-        <w:rPr>
-          <w:sz w:val="24"/>
-          <w:szCs w:val="24"/>
-        </w:rPr>
-        <w:t xml:space="preserve">+ </w:t>
-      </w:r>
-      <w:r>
-        <w:rPr>
-          <w:sz w:val="24"/>
-          <w:szCs w:val="24"/>
-        </w:rPr>
-        <w:t>Button lưu bài viết (khi bấm lưu sẽ copy bài viết hoặc lưu tên bài vào sub tab 3 Bài đọc đã lưu. Người dùng có thể click vào bài viết ở sub tab 3 hoặc 1/2 để xem chi tiết)</w:t>
+      <w:bookmarkStart w:id="11" w:name="_Hlk223687662"/>
+      <w:r>
+        <w:rPr>
+          <w:sz w:val="24"/>
+          <w:szCs w:val="24"/>
+        </w:rPr>
+        <w:t>Tab hiển thị các nội dung kiến thức theo chủ đề</w:t>
+      </w:r>
+      <w:r>
+        <w:rPr>
+          <w:sz w:val="24"/>
+          <w:szCs w:val="24"/>
+        </w:rPr>
+        <w:t xml:space="preserve">. Các bài viết </w:t>
+      </w:r>
+      <w:r>
+        <w:rPr>
+          <w:sz w:val="24"/>
+          <w:szCs w:val="24"/>
+        </w:rPr>
+        <w:t xml:space="preserve">có </w:t>
+      </w:r>
+      <w:r>
+        <w:rPr>
+          <w:sz w:val="24"/>
+          <w:szCs w:val="24"/>
+        </w:rPr>
+        <w:t>hiển thị 1 phần nội dung</w:t>
+      </w:r>
+      <w:r>
+        <w:rPr>
+          <w:sz w:val="24"/>
+          <w:szCs w:val="24"/>
+        </w:rPr>
+        <w:t xml:space="preserve"> và button "Xem chi tiết" để đọc toàn bộ bài viết</w:t>
+      </w:r>
+      <w:r>
+        <w:rPr>
+          <w:sz w:val="24"/>
+          <w:szCs w:val="24"/>
+        </w:rPr>
+        <w:t>.</w:t>
       </w:r>
     </w:p>
     <w:p>
@@ -11344,14 +13440,65 @@
           <w:sz w:val="24"/>
           <w:szCs w:val="24"/>
         </w:rPr>
-        <w:t>+ B</w:t>
-      </w:r>
-      <w:r>
-        <w:rPr>
-          <w:sz w:val="24"/>
-          <w:szCs w:val="24"/>
-        </w:rPr>
-        <w:t>utton rating 1 sao – 5 sao cho bài viết</w:t>
+        <w:t xml:space="preserve">Mỗi bài viết được gắn tag để phân loại mục đích cho người đọc dễ nhận diện: </w:t>
+      </w:r>
+      <w:r>
+        <w:rPr>
+          <w:sz w:val="24"/>
+          <w:szCs w:val="24"/>
+        </w:rPr>
+        <w:t>hiểu vấn đề của con</w:t>
+      </w:r>
+      <w:r>
+        <w:rPr>
+          <w:sz w:val="24"/>
+          <w:szCs w:val="24"/>
+        </w:rPr>
+        <w:t>/</w:t>
+      </w:r>
+      <w:r>
+        <w:t xml:space="preserve"> </w:t>
+      </w:r>
+      <w:r>
+        <w:rPr>
+          <w:sz w:val="24"/>
+          <w:szCs w:val="24"/>
+        </w:rPr>
+        <w:t>giải thích dữ liệu trong app</w:t>
+      </w:r>
+      <w:r>
+        <w:rPr>
+          <w:sz w:val="24"/>
+          <w:szCs w:val="24"/>
+        </w:rPr>
+        <w:t>/</w:t>
+      </w:r>
+      <w:r>
+        <w:t xml:space="preserve"> </w:t>
+      </w:r>
+      <w:r>
+        <w:rPr>
+          <w:sz w:val="24"/>
+          <w:szCs w:val="24"/>
+        </w:rPr>
+        <w:t>có hành động cụ thể</w:t>
+      </w:r>
+      <w:r>
+        <w:rPr>
+          <w:sz w:val="24"/>
+          <w:szCs w:val="24"/>
+        </w:rPr>
+        <w:t>/</w:t>
+      </w:r>
+      <w:r>
+        <w:t xml:space="preserve"> </w:t>
+      </w:r>
+      <w:r>
+        <w:rPr>
+          <w:sz w:val="24"/>
+          <w:szCs w:val="24"/>
+        </w:rPr>
+        <w:t>biết cách quan sát</w:t>
       </w:r>
     </w:p>
     <w:p>
@@ -11367,6 +13514,45 @@
           <w:sz w:val="24"/>
           <w:szCs w:val="24"/>
         </w:rPr>
+        <w:t xml:space="preserve">Khi đọc chi tiết bài viết có các button sau: </w:t>
+      </w:r>
+    </w:p>
+    <w:p>
+      <w:pPr>
+        <w:spacing w:line="288" w:lineRule="auto"/>
+        <w:rPr>
+          <w:sz w:val="24"/>
+          <w:szCs w:val="24"/>
+        </w:rPr>
+      </w:pPr>
+      <w:r>
+        <w:rPr>
+          <w:sz w:val="24"/>
+          <w:szCs w:val="24"/>
+        </w:rPr>
+        <w:t xml:space="preserve">+ </w:t>
+      </w:r>
+      <w:r>
+        <w:rPr>
+          <w:sz w:val="24"/>
+          <w:szCs w:val="24"/>
+        </w:rPr>
+        <w:t>Button lưu bài viết (khi bấm lưu sẽ copy bài viết hoặc lưu tên bài vào sub tab 3 Bài đọc đã lưu. Người dùng có thể click vào bài viết ở sub tab 3 hoặc 1/2 để xem chi tiết)</w:t>
+      </w:r>
+    </w:p>
+    <w:p>
+      <w:pPr>
+        <w:spacing w:line="288" w:lineRule="auto"/>
+        <w:rPr>
+          <w:sz w:val="24"/>
+          <w:szCs w:val="24"/>
+        </w:rPr>
+      </w:pPr>
+      <w:r>
+        <w:rPr>
+          <w:sz w:val="24"/>
+          <w:szCs w:val="24"/>
+        </w:rPr>
         <w:t>+ B</w:t>
       </w:r>
       <w:r>
@@ -11374,6 +13560,29 @@
           <w:sz w:val="24"/>
           <w:szCs w:val="24"/>
         </w:rPr>
+        <w:t>utton rating 1 sao – 5 sao cho bài viết</w:t>
+      </w:r>
+    </w:p>
+    <w:p>
+      <w:pPr>
+        <w:spacing w:line="288" w:lineRule="auto"/>
+        <w:rPr>
+          <w:sz w:val="24"/>
+          <w:szCs w:val="24"/>
+        </w:rPr>
+      </w:pPr>
+      <w:r>
+        <w:rPr>
+          <w:sz w:val="24"/>
+          <w:szCs w:val="24"/>
+        </w:rPr>
+        <w:t>+ B</w:t>
+      </w:r>
+      <w:r>
+        <w:rPr>
+          <w:sz w:val="24"/>
+          <w:szCs w:val="24"/>
+        </w:rPr>
         <w:t xml:space="preserve">utton chia sẻ bài viết cho user </w:t>
       </w:r>
       <w:r>
@@ -11383,7 +13592,7 @@
         </w:rPr>
         <w:t>khác.</w:t>
       </w:r>
-      <w:bookmarkEnd w:id="8"/>
+      <w:bookmarkEnd w:id="11"/>
     </w:p>
     <w:sectPr>
       <w:pgSz w:w="12240" w:h="15840"/>

</xml_diff>